<commit_message>
Cambios realizados en el Proyecto
</commit_message>
<xml_diff>
--- a/PROYECTO_MATEOSRAMOS_OSCAR/docu/DocumentacionProyectoOscarMateosRamos_2VIFC302.docx
+++ b/PROYECTO_MATEOSRAMOS_OSCAR/docu/DocumentacionProyectoOscarMateosRamos_2VIFC302.docx
@@ -5089,27 +5089,14 @@
       <w:r>
         <w:t xml:space="preserve">Tabla </w:t>
       </w:r>
-      <w:r>
-        <w:fldChar w:fldCharType="begin"/>
-      </w:r>
-      <w:r>
-        <w:instrText xml:space="preserve"> SEQ Tabla \* ARABIC </w:instrText>
-      </w:r>
-      <w:r>
-        <w:fldChar w:fldCharType="separate"/>
-      </w:r>
-      <w:r>
-        <w:rPr>
-          <w:noProof/>
-        </w:rPr>
-        <w:t>1</w:t>
-      </w:r>
-      <w:r>
-        <w:rPr>
-          <w:noProof/>
-        </w:rPr>
-        <w:fldChar w:fldCharType="end"/>
-      </w:r>
+      <w:fldSimple w:instr=" SEQ Tabla \* ARABIC ">
+        <w:r>
+          <w:rPr>
+            <w:noProof/>
+          </w:rPr>
+          <w:t>1</w:t>
+        </w:r>
+      </w:fldSimple>
       <w:bookmarkEnd w:id="10"/>
       <w:r>
         <w:t>. Módulos y requisitos funcionales</w:t>
@@ -6428,27 +6415,14 @@
       <w:r>
         <w:t xml:space="preserve">Tabla </w:t>
       </w:r>
-      <w:r>
-        <w:fldChar w:fldCharType="begin"/>
-      </w:r>
-      <w:r>
-        <w:instrText xml:space="preserve"> SEQ Tabla \* ARABIC </w:instrText>
-      </w:r>
-      <w:r>
-        <w:fldChar w:fldCharType="separate"/>
-      </w:r>
-      <w:r>
-        <w:rPr>
-          <w:noProof/>
-        </w:rPr>
-        <w:t>3</w:t>
-      </w:r>
-      <w:r>
-        <w:rPr>
-          <w:noProof/>
-        </w:rPr>
-        <w:fldChar w:fldCharType="end"/>
-      </w:r>
+      <w:fldSimple w:instr=" SEQ Tabla \* ARABIC ">
+        <w:r>
+          <w:rPr>
+            <w:noProof/>
+          </w:rPr>
+          <w:t>3</w:t>
+        </w:r>
+      </w:fldSimple>
       <w:bookmarkEnd w:id="12"/>
       <w:r>
         <w:t>. Requisitos no funcionales</w:t>
@@ -6875,8 +6849,16 @@
     </w:p>
     <w:p>
       <w:r>
-        <w:t>CU17 – Registro de incidencias</w:t>
-      </w:r>
+        <w:t xml:space="preserve">CU17 – Registro </w:t>
+      </w:r>
+      <w:proofErr w:type="gramStart"/>
+      <w:r>
+        <w:t xml:space="preserve">de </w:t>
+      </w:r>
+      <w:r>
+        <w:t xml:space="preserve"> Faltas</w:t>
+      </w:r>
+      <w:proofErr w:type="gramEnd"/>
     </w:p>
     <w:p>
       <w:r>
@@ -6912,6 +6894,9 @@
         <w:keepNext/>
       </w:pPr>
       <w:r>
+        <w:rPr>
+          <w:noProof/>
+        </w:rPr>
         <w:drawing>
           <wp:inline distT="0" distB="0" distL="0" distR="0" wp14:anchorId="3F48DBC0" wp14:editId="28CFFDE1">
             <wp:extent cx="6120130" cy="3738245"/>
@@ -7044,27 +7029,14 @@
       <w:r>
         <w:t xml:space="preserve">Tabla </w:t>
       </w:r>
-      <w:r>
-        <w:fldChar w:fldCharType="begin"/>
-      </w:r>
-      <w:r>
-        <w:instrText xml:space="preserve"> SEQ Tabla \* ARABIC </w:instrText>
-      </w:r>
-      <w:r>
-        <w:fldChar w:fldCharType="separate"/>
-      </w:r>
-      <w:r>
-        <w:rPr>
-          <w:noProof/>
-        </w:rPr>
-        <w:t>2</w:t>
-      </w:r>
-      <w:r>
-        <w:rPr>
-          <w:noProof/>
-        </w:rPr>
-        <w:fldChar w:fldCharType="end"/>
-      </w:r>
+      <w:fldSimple w:instr=" SEQ Tabla \* ARABIC ">
+        <w:r>
+          <w:rPr>
+            <w:noProof/>
+          </w:rPr>
+          <w:t>2</w:t>
+        </w:r>
+      </w:fldSimple>
       <w:bookmarkEnd w:id="17"/>
       <w:r>
         <w:t>. Actores de la aplicación</w:t>
@@ -8511,7 +8483,14 @@
           <w:b/>
           <w:bCs/>
         </w:rPr>
-        <w:t>CU12 – Registrar faltas de asistencia</w:t>
+        <w:t>CU12 – Registrar faltas de asisten</w:t>
+      </w:r>
+      <w:r>
+        <w:rPr>
+          <w:b/>
+          <w:bCs/>
+        </w:rPr>
+        <w:t>cia</w:t>
       </w:r>
     </w:p>
     <w:p>
@@ -10527,7 +10506,7 @@
           <w:b/>
           <w:bCs/>
         </w:rPr>
-        <w:t>Asistencia</w:t>
+        <w:t>Faltas</w:t>
       </w:r>
     </w:p>
     <w:p>
@@ -11157,6 +11136,9 @@
     </w:p>
     <w:p>
       <w:r>
+        <w:rPr>
+          <w:noProof/>
+        </w:rPr>
         <w:drawing>
           <wp:inline distT="0" distB="0" distL="0" distR="0" wp14:anchorId="6BE3C8C3" wp14:editId="6F2AF684">
             <wp:extent cx="6120130" cy="7579995"/>
@@ -21276,6 +21258,7 @@
   <w:style w:type="character" w:default="1" w:styleId="Fuentedeprrafopredeter">
     <w:name w:val="Default Paragraph Font"/>
     <w:uiPriority w:val="1"/>
+    <w:semiHidden/>
     <w:unhideWhenUsed/>
   </w:style>
   <w:style w:type="table" w:default="1" w:styleId="Tablanormal">
@@ -22163,21 +22146,6 @@
 </file>
 
 <file path=customXml/item1.xml><?xml version="1.0" encoding="utf-8"?>
-<?mso-contentType ?>
-<FormTemplates xmlns="http://schemas.microsoft.com/sharepoint/v3/contenttype/forms">
-  <Display>DocumentLibraryForm</Display>
-  <Edit>DocumentLibraryForm</Edit>
-  <New>DocumentLibraryForm</New>
-</FormTemplates>
-</file>
-
-<file path=customXml/item2.xml><?xml version="1.0" encoding="utf-8"?>
-<p:properties xmlns:p="http://schemas.microsoft.com/office/2006/metadata/properties" xmlns:xsi="http://www.w3.org/2001/XMLSchema-instance" xmlns:pc="http://schemas.microsoft.com/office/infopath/2007/PartnerControls">
-  <documentManagement/>
-</p:properties>
-</file>
-
-<file path=customXml/item3.xml><?xml version="1.0" encoding="utf-8"?>
 <ct:contentTypeSchema xmlns:ct="http://schemas.microsoft.com/office/2006/metadata/contentType" xmlns:ma="http://schemas.microsoft.com/office/2006/metadata/properties/metaAttributes" ct:_="" ma:_="" ma:contentTypeName="Documento" ma:contentTypeID="0x0101003E64B964EE86E94E88810388061E4AC8" ma:contentTypeVersion="3" ma:contentTypeDescription="Crear nuevo documento." ma:contentTypeScope="" ma:versionID="3c755de4efb81f0959f76dfe4f7a563c">
   <xsd:schema xmlns:xsd="http://www.w3.org/2001/XMLSchema" xmlns:xs="http://www.w3.org/2001/XMLSchema" xmlns:p="http://schemas.microsoft.com/office/2006/metadata/properties" xmlns:ns2="72982a07-b385-426f-8f99-a9bd2486cbec" targetNamespace="http://schemas.microsoft.com/office/2006/metadata/properties" ma:root="true" ma:fieldsID="5f645ab2d71ed821d1fb93c6441734aa" ns2:_="">
     <xsd:import namespace="72982a07-b385-426f-8f99-a9bd2486cbec"/>
@@ -22315,28 +22283,26 @@
 </ct:contentTypeSchema>
 </file>
 
+<file path=customXml/item2.xml><?xml version="1.0" encoding="utf-8"?>
+<p:properties xmlns:p="http://schemas.microsoft.com/office/2006/metadata/properties" xmlns:xsi="http://www.w3.org/2001/XMLSchema-instance" xmlns:pc="http://schemas.microsoft.com/office/infopath/2007/PartnerControls">
+  <documentManagement/>
+</p:properties>
+</file>
+
+<file path=customXml/item3.xml><?xml version="1.0" encoding="utf-8"?>
+<?mso-contentType ?>
+<FormTemplates xmlns="http://schemas.microsoft.com/sharepoint/v3/contenttype/forms">
+  <Display>DocumentLibraryForm</Display>
+  <Edit>DocumentLibraryForm</Edit>
+  <New>DocumentLibraryForm</New>
+</FormTemplates>
+</file>
+
 <file path=customXml/item4.xml><?xml version="1.0" encoding="utf-8"?>
 <b:Sources xmlns:b="http://schemas.openxmlformats.org/officeDocument/2006/bibliography" xmlns="http://schemas.openxmlformats.org/officeDocument/2006/bibliography" SelectedStyle="\APASixthEditionOfficeOnline.xsl" StyleName="APA" Version="6"/>
 </file>
 
 <file path=customXml/itemProps1.xml><?xml version="1.0" encoding="utf-8"?>
-<ds:datastoreItem xmlns:ds="http://schemas.openxmlformats.org/officeDocument/2006/customXml" ds:itemID="{480B8420-1B48-4D23-8D6E-64373AC5070B}">
-  <ds:schemaRefs>
-    <ds:schemaRef ds:uri="http://schemas.microsoft.com/sharepoint/v3/contenttype/forms"/>
-  </ds:schemaRefs>
-</ds:datastoreItem>
-</file>
-
-<file path=customXml/itemProps2.xml><?xml version="1.0" encoding="utf-8"?>
-<ds:datastoreItem xmlns:ds="http://schemas.openxmlformats.org/officeDocument/2006/customXml" ds:itemID="{7F0B1298-25D5-45B9-909D-DD837044A49E}">
-  <ds:schemaRefs>
-    <ds:schemaRef ds:uri="http://schemas.microsoft.com/office/2006/metadata/properties"/>
-    <ds:schemaRef ds:uri="http://schemas.microsoft.com/office/infopath/2007/PartnerControls"/>
-  </ds:schemaRefs>
-</ds:datastoreItem>
-</file>
-
-<file path=customXml/itemProps3.xml><?xml version="1.0" encoding="utf-8"?>
 <ds:datastoreItem xmlns:ds="http://schemas.openxmlformats.org/officeDocument/2006/customXml" ds:itemID="{CAB20FFE-1E23-4B58-9D76-1835AB7D3BED}">
   <ds:schemaRefs>
     <ds:schemaRef ds:uri="http://schemas.microsoft.com/office/2006/metadata/contentType"/>
@@ -22354,6 +22320,23 @@
 </ds:datastoreItem>
 </file>
 
+<file path=customXml/itemProps2.xml><?xml version="1.0" encoding="utf-8"?>
+<ds:datastoreItem xmlns:ds="http://schemas.openxmlformats.org/officeDocument/2006/customXml" ds:itemID="{7F0B1298-25D5-45B9-909D-DD837044A49E}">
+  <ds:schemaRefs>
+    <ds:schemaRef ds:uri="http://schemas.microsoft.com/office/2006/metadata/properties"/>
+    <ds:schemaRef ds:uri="http://schemas.microsoft.com/office/infopath/2007/PartnerControls"/>
+  </ds:schemaRefs>
+</ds:datastoreItem>
+</file>
+
+<file path=customXml/itemProps3.xml><?xml version="1.0" encoding="utf-8"?>
+<ds:datastoreItem xmlns:ds="http://schemas.openxmlformats.org/officeDocument/2006/customXml" ds:itemID="{480B8420-1B48-4D23-8D6E-64373AC5070B}">
+  <ds:schemaRefs>
+    <ds:schemaRef ds:uri="http://schemas.microsoft.com/sharepoint/v3/contenttype/forms"/>
+  </ds:schemaRefs>
+</ds:datastoreItem>
+</file>
+
 <file path=customXml/itemProps4.xml><?xml version="1.0" encoding="utf-8"?>
 <ds:datastoreItem xmlns:ds="http://schemas.openxmlformats.org/officeDocument/2006/customXml" ds:itemID="{BDF99D19-6C5D-43D5-B443-C33B3ADCE9C1}">
   <ds:schemaRefs>

</xml_diff>

<commit_message>
Cambios realizados en la Documentacion
</commit_message>
<xml_diff>
--- a/PROYECTO_MATEOSRAMOS_OSCAR/docu/DocumentacionProyectoOscarMateosRamos_2VIFC302.docx
+++ b/PROYECTO_MATEOSRAMOS_OSCAR/docu/DocumentacionProyectoOscarMateosRamos_2VIFC302.docx
@@ -9405,15 +9405,7 @@
       </w:r>
       <w:proofErr w:type="spellEnd"/>
       <w:r>
-        <w:t xml:space="preserve"> (</w:t>
-      </w:r>
-      <w:proofErr w:type="spellStart"/>
-      <w:r>
-        <w:t>PK</w:t>
-      </w:r>
-      <w:proofErr w:type="spellEnd"/>
-      <w:r>
-        <w:t>)</w:t>
+        <w:t xml:space="preserve"> (PK)</w:t>
       </w:r>
     </w:p>
     <w:p>
@@ -9468,15 +9460,7 @@
         </w:numPr>
       </w:pPr>
       <w:r>
-        <w:t>perfil (</w:t>
-      </w:r>
-      <w:proofErr w:type="spellStart"/>
-      <w:r>
-        <w:t>ENUM</w:t>
-      </w:r>
-      <w:proofErr w:type="spellEnd"/>
-      <w:r>
-        <w:t>: 'Administrador', 'Profesorado', 'Tutor', 'Estudiante')</w:t>
+        <w:t>perfil (ENUM: 'Administrador', 'Profesorado', 'Tutor', 'Estudiante')</w:t>
       </w:r>
     </w:p>
     <w:p>
@@ -9521,15 +9505,7 @@
       </w:r>
       <w:proofErr w:type="spellEnd"/>
       <w:r>
-        <w:t xml:space="preserve"> (</w:t>
-      </w:r>
-      <w:proofErr w:type="spellStart"/>
-      <w:r>
-        <w:t>PK</w:t>
-      </w:r>
-      <w:proofErr w:type="spellEnd"/>
-      <w:r>
-        <w:t>)</w:t>
+        <w:t xml:space="preserve"> (PK)</w:t>
       </w:r>
     </w:p>
     <w:p>
@@ -9545,15 +9521,7 @@
       </w:r>
       <w:proofErr w:type="spellEnd"/>
       <w:r>
-        <w:t xml:space="preserve"> (</w:t>
-      </w:r>
-      <w:proofErr w:type="spellStart"/>
-      <w:r>
-        <w:t>FK</w:t>
-      </w:r>
-      <w:proofErr w:type="spellEnd"/>
-      <w:r>
-        <w:t>)</w:t>
+        <w:t xml:space="preserve"> (FK)</w:t>
       </w:r>
     </w:p>
     <w:p>
@@ -9569,15 +9537,7 @@
       </w:r>
       <w:proofErr w:type="spellEnd"/>
       <w:r>
-        <w:t xml:space="preserve"> (</w:t>
-      </w:r>
-      <w:proofErr w:type="spellStart"/>
-      <w:r>
-        <w:t>FK</w:t>
-      </w:r>
-      <w:proofErr w:type="spellEnd"/>
-      <w:r>
-        <w:t>) — Grupo al que pertenece el estudiante</w:t>
+        <w:t xml:space="preserve"> (FK) — Grupo al que pertenece el estudiante</w:t>
       </w:r>
     </w:p>
     <w:p>
@@ -9706,15 +9666,7 @@
       </w:r>
       <w:proofErr w:type="spellEnd"/>
       <w:r>
-        <w:t xml:space="preserve"> (</w:t>
-      </w:r>
-      <w:proofErr w:type="spellStart"/>
-      <w:r>
-        <w:t>PK</w:t>
-      </w:r>
-      <w:proofErr w:type="spellEnd"/>
-      <w:r>
-        <w:t>)</w:t>
+        <w:t xml:space="preserve"> (PK)</w:t>
       </w:r>
     </w:p>
     <w:p>
@@ -9730,15 +9682,7 @@
       </w:r>
       <w:proofErr w:type="spellEnd"/>
       <w:r>
-        <w:t xml:space="preserve"> (</w:t>
-      </w:r>
-      <w:proofErr w:type="spellStart"/>
-      <w:r>
-        <w:t>FK</w:t>
-      </w:r>
-      <w:proofErr w:type="spellEnd"/>
-      <w:r>
-        <w:t>)</w:t>
+        <w:t xml:space="preserve"> (FK)</w:t>
       </w:r>
     </w:p>
     <w:p>
@@ -9787,15 +9731,7 @@
         </w:numPr>
       </w:pPr>
       <w:r>
-        <w:t>especialidad (</w:t>
-      </w:r>
-      <w:proofErr w:type="spellStart"/>
-      <w:r>
-        <w:t>ENUM</w:t>
-      </w:r>
-      <w:proofErr w:type="spellEnd"/>
-      <w:r>
-        <w:t>, ej.: “D</w:t>
+        <w:t>especialidad (ENUM, ej.: “D</w:t>
       </w:r>
       <w:r>
         <w:t>AW; DAM ; ASIR</w:t>
@@ -9846,15 +9782,7 @@
       </w:r>
       <w:proofErr w:type="spellEnd"/>
       <w:r>
-        <w:t xml:space="preserve"> (</w:t>
-      </w:r>
-      <w:proofErr w:type="spellStart"/>
-      <w:r>
-        <w:t>BOOLEAN</w:t>
-      </w:r>
-      <w:proofErr w:type="spellEnd"/>
-      <w:r>
-        <w:t>) — Indica si coordina algún curso o ciclo</w:t>
+        <w:t xml:space="preserve"> (BOOLEAN) — Indica si coordina algún curso o ciclo</w:t>
       </w:r>
     </w:p>
     <w:p>
@@ -9926,15 +9854,7 @@
       </w:r>
       <w:proofErr w:type="spellEnd"/>
       <w:r>
-        <w:t xml:space="preserve"> (</w:t>
-      </w:r>
-      <w:proofErr w:type="spellStart"/>
-      <w:r>
-        <w:t>PK</w:t>
-      </w:r>
-      <w:proofErr w:type="spellEnd"/>
-      <w:r>
-        <w:t>)</w:t>
+        <w:t xml:space="preserve"> (PK)</w:t>
       </w:r>
     </w:p>
     <w:p>
@@ -9950,15 +9870,7 @@
       </w:r>
       <w:proofErr w:type="spellEnd"/>
       <w:r>
-        <w:t xml:space="preserve"> (</w:t>
-      </w:r>
-      <w:proofErr w:type="spellStart"/>
-      <w:r>
-        <w:t>FK</w:t>
-      </w:r>
-      <w:proofErr w:type="spellEnd"/>
-      <w:r>
-        <w:t>)</w:t>
+        <w:t xml:space="preserve"> (FK)</w:t>
       </w:r>
     </w:p>
     <w:p>
@@ -9974,15 +9886,7 @@
       </w:r>
       <w:proofErr w:type="spellEnd"/>
       <w:r>
-        <w:t xml:space="preserve"> (</w:t>
-      </w:r>
-      <w:proofErr w:type="spellStart"/>
-      <w:r>
-        <w:t>FK</w:t>
-      </w:r>
-      <w:proofErr w:type="spellEnd"/>
-      <w:r>
-        <w:t>)</w:t>
+        <w:t xml:space="preserve"> (FK)</w:t>
       </w:r>
     </w:p>
     <w:p>
@@ -10057,15 +9961,7 @@
       </w:r>
       <w:proofErr w:type="spellEnd"/>
       <w:r>
-        <w:t xml:space="preserve"> (</w:t>
-      </w:r>
-      <w:proofErr w:type="spellStart"/>
-      <w:r>
-        <w:t>PK</w:t>
-      </w:r>
-      <w:proofErr w:type="spellEnd"/>
-      <w:r>
-        <w:t>)</w:t>
+        <w:t xml:space="preserve"> (PK)</w:t>
       </w:r>
     </w:p>
     <w:p>
@@ -10132,15 +10028,7 @@
       </w:r>
       <w:proofErr w:type="spellEnd"/>
       <w:r>
-        <w:t xml:space="preserve"> (</w:t>
-      </w:r>
-      <w:proofErr w:type="spellStart"/>
-      <w:r>
-        <w:t>PK</w:t>
-      </w:r>
-      <w:proofErr w:type="spellEnd"/>
-      <w:r>
-        <w:t>)</w:t>
+        <w:t xml:space="preserve"> (PK)</w:t>
       </w:r>
     </w:p>
     <w:p>
@@ -10156,15 +10044,7 @@
       </w:r>
       <w:proofErr w:type="spellEnd"/>
       <w:r>
-        <w:t xml:space="preserve"> (</w:t>
-      </w:r>
-      <w:proofErr w:type="spellStart"/>
-      <w:r>
-        <w:t>FK</w:t>
-      </w:r>
-      <w:proofErr w:type="spellEnd"/>
-      <w:r>
-        <w:t>)</w:t>
+        <w:t xml:space="preserve"> (FK)</w:t>
       </w:r>
     </w:p>
     <w:p>
@@ -10239,15 +10119,7 @@
       </w:r>
       <w:proofErr w:type="spellEnd"/>
       <w:r>
-        <w:t xml:space="preserve"> (</w:t>
-      </w:r>
-      <w:proofErr w:type="spellStart"/>
-      <w:r>
-        <w:t>PK</w:t>
-      </w:r>
-      <w:proofErr w:type="spellEnd"/>
-      <w:r>
-        <w:t>)</w:t>
+        <w:t xml:space="preserve"> (PK)</w:t>
       </w:r>
     </w:p>
     <w:p>
@@ -10263,15 +10135,7 @@
       </w:r>
       <w:proofErr w:type="spellEnd"/>
       <w:r>
-        <w:t xml:space="preserve"> (</w:t>
-      </w:r>
-      <w:proofErr w:type="spellStart"/>
-      <w:r>
-        <w:t>FK</w:t>
-      </w:r>
-      <w:proofErr w:type="spellEnd"/>
-      <w:r>
-        <w:t>)</w:t>
+        <w:t xml:space="preserve"> (FK)</w:t>
       </w:r>
     </w:p>
     <w:p>
@@ -10322,15 +10186,7 @@
       </w:r>
       <w:proofErr w:type="spellEnd"/>
       <w:r>
-        <w:t xml:space="preserve"> (</w:t>
-      </w:r>
-      <w:proofErr w:type="spellStart"/>
-      <w:r>
-        <w:t>PK</w:t>
-      </w:r>
-      <w:proofErr w:type="spellEnd"/>
-      <w:r>
-        <w:t>)</w:t>
+        <w:t xml:space="preserve"> (PK)</w:t>
       </w:r>
     </w:p>
     <w:p>
@@ -10394,15 +10250,7 @@
       </w:r>
       <w:proofErr w:type="spellEnd"/>
       <w:r>
-        <w:t xml:space="preserve"> (</w:t>
-      </w:r>
-      <w:proofErr w:type="spellStart"/>
-      <w:r>
-        <w:t>PK</w:t>
-      </w:r>
-      <w:proofErr w:type="spellEnd"/>
-      <w:r>
-        <w:t>)</w:t>
+        <w:t xml:space="preserve"> (PK)</w:t>
       </w:r>
     </w:p>
     <w:p>
@@ -10418,15 +10266,7 @@
       </w:r>
       <w:proofErr w:type="spellEnd"/>
       <w:r>
-        <w:t xml:space="preserve"> (</w:t>
-      </w:r>
-      <w:proofErr w:type="spellStart"/>
-      <w:r>
-        <w:t>FK</w:t>
-      </w:r>
-      <w:proofErr w:type="spellEnd"/>
-      <w:r>
-        <w:t>)</w:t>
+        <w:t xml:space="preserve"> (FK)</w:t>
       </w:r>
     </w:p>
     <w:p>
@@ -10442,15 +10282,7 @@
       </w:r>
       <w:proofErr w:type="spellEnd"/>
       <w:r>
-        <w:t xml:space="preserve"> (</w:t>
-      </w:r>
-      <w:proofErr w:type="spellStart"/>
-      <w:r>
-        <w:t>FK</w:t>
-      </w:r>
-      <w:proofErr w:type="spellEnd"/>
-      <w:r>
-        <w:t>)</w:t>
+        <w:t xml:space="preserve"> (FK)</w:t>
       </w:r>
     </w:p>
     <w:p>
@@ -10466,15 +10298,7 @@
       </w:r>
       <w:proofErr w:type="spellEnd"/>
       <w:r>
-        <w:t xml:space="preserve"> (</w:t>
-      </w:r>
-      <w:proofErr w:type="spellStart"/>
-      <w:r>
-        <w:t>FK</w:t>
-      </w:r>
-      <w:proofErr w:type="spellEnd"/>
-      <w:r>
-        <w:t>) — Tutor de empresa asignado</w:t>
+        <w:t xml:space="preserve"> (FK) — Tutor de empresa asignado</w:t>
       </w:r>
     </w:p>
     <w:p>
@@ -10490,15 +10314,7 @@
       </w:r>
       <w:proofErr w:type="spellEnd"/>
       <w:r>
-        <w:t xml:space="preserve"> (</w:t>
-      </w:r>
-      <w:proofErr w:type="spellStart"/>
-      <w:r>
-        <w:t>FK</w:t>
-      </w:r>
-      <w:proofErr w:type="spellEnd"/>
-      <w:r>
-        <w:t>) — Profesor que coordina la formación</w:t>
+        <w:t xml:space="preserve"> (FK) — Profesor que coordina la formación</w:t>
       </w:r>
     </w:p>
     <w:p>
@@ -10535,15 +10351,7 @@
         </w:numPr>
       </w:pPr>
       <w:r>
-        <w:t>periodo (</w:t>
-      </w:r>
-      <w:proofErr w:type="spellStart"/>
-      <w:r>
-        <w:t>ENUM</w:t>
-      </w:r>
-      <w:proofErr w:type="spellEnd"/>
-      <w:r>
-        <w:t>: 'Ordinario', 'Extraordinario')</w:t>
+        <w:t>periodo (ENUM: 'Ordinario', 'Extraordinario')</w:t>
       </w:r>
     </w:p>
     <w:p>
@@ -10583,15 +10391,7 @@
       </w:r>
       <w:proofErr w:type="spellEnd"/>
       <w:r>
-        <w:t xml:space="preserve"> (</w:t>
-      </w:r>
-      <w:proofErr w:type="spellStart"/>
-      <w:r>
-        <w:t>PK</w:t>
-      </w:r>
-      <w:proofErr w:type="spellEnd"/>
-      <w:r>
-        <w:t>)</w:t>
+        <w:t xml:space="preserve"> (PK)</w:t>
       </w:r>
     </w:p>
     <w:p>
@@ -10607,15 +10407,7 @@
       </w:r>
       <w:proofErr w:type="spellEnd"/>
       <w:r>
-        <w:t xml:space="preserve"> (</w:t>
-      </w:r>
-      <w:proofErr w:type="spellStart"/>
-      <w:r>
-        <w:t>FK</w:t>
-      </w:r>
-      <w:proofErr w:type="spellEnd"/>
-      <w:r>
-        <w:t>)</w:t>
+        <w:t xml:space="preserve"> (FK)</w:t>
       </w:r>
     </w:p>
     <w:p>
@@ -10637,15 +10429,7 @@
         </w:numPr>
       </w:pPr>
       <w:r>
-        <w:t>tipo (</w:t>
-      </w:r>
-      <w:proofErr w:type="spellStart"/>
-      <w:r>
-        <w:t>ENUM</w:t>
-      </w:r>
-      <w:proofErr w:type="spellEnd"/>
-      <w:r>
-        <w:t>: 'Falta', 'Retraso')</w:t>
+        <w:t>tipo (ENUM: 'Falta', 'Retraso')</w:t>
       </w:r>
     </w:p>
     <w:p>
@@ -10710,15 +10494,7 @@
       </w:r>
       <w:proofErr w:type="spellEnd"/>
       <w:r>
-        <w:t xml:space="preserve"> (</w:t>
-      </w:r>
-      <w:proofErr w:type="spellStart"/>
-      <w:r>
-        <w:t>PK</w:t>
-      </w:r>
-      <w:proofErr w:type="spellEnd"/>
-      <w:r>
-        <w:t>)</w:t>
+        <w:t xml:space="preserve"> (PK)</w:t>
       </w:r>
     </w:p>
     <w:p>
@@ -10734,15 +10510,7 @@
       </w:r>
       <w:proofErr w:type="spellEnd"/>
       <w:r>
-        <w:t xml:space="preserve"> (</w:t>
-      </w:r>
-      <w:proofErr w:type="spellStart"/>
-      <w:r>
-        <w:t>FK</w:t>
-      </w:r>
-      <w:proofErr w:type="spellEnd"/>
-      <w:r>
-        <w:t>)</w:t>
+        <w:t xml:space="preserve"> (FK)</w:t>
       </w:r>
     </w:p>
     <w:p>
@@ -10815,15 +10583,7 @@
       </w:r>
       <w:proofErr w:type="spellEnd"/>
       <w:r>
-        <w:t xml:space="preserve"> (</w:t>
-      </w:r>
-      <w:proofErr w:type="spellStart"/>
-      <w:r>
-        <w:t>PK</w:t>
-      </w:r>
-      <w:proofErr w:type="spellEnd"/>
-      <w:r>
-        <w:t>)</w:t>
+        <w:t xml:space="preserve"> (PK)</w:t>
       </w:r>
     </w:p>
     <w:p>
@@ -10839,15 +10599,7 @@
       </w:r>
       <w:proofErr w:type="spellEnd"/>
       <w:r>
-        <w:t xml:space="preserve"> (</w:t>
-      </w:r>
-      <w:proofErr w:type="spellStart"/>
-      <w:r>
-        <w:t>FK</w:t>
-      </w:r>
-      <w:proofErr w:type="spellEnd"/>
-      <w:r>
-        <w:t>)</w:t>
+        <w:t xml:space="preserve"> (FK)</w:t>
       </w:r>
     </w:p>
     <w:p>
@@ -10913,15 +10665,7 @@
       </w:r>
       <w:proofErr w:type="spellEnd"/>
       <w:r>
-        <w:t xml:space="preserve"> (</w:t>
-      </w:r>
-      <w:proofErr w:type="spellStart"/>
-      <w:r>
-        <w:t>PK</w:t>
-      </w:r>
-      <w:proofErr w:type="spellEnd"/>
-      <w:r>
-        <w:t>)</w:t>
+        <w:t xml:space="preserve"> (PK)</w:t>
       </w:r>
     </w:p>
     <w:p>
@@ -10937,15 +10681,7 @@
       </w:r>
       <w:proofErr w:type="spellEnd"/>
       <w:r>
-        <w:t xml:space="preserve"> (</w:t>
-      </w:r>
-      <w:proofErr w:type="spellStart"/>
-      <w:r>
-        <w:t>FK</w:t>
-      </w:r>
-      <w:proofErr w:type="spellEnd"/>
-      <w:r>
-        <w:t>)</w:t>
+        <w:t xml:space="preserve"> (FK)</w:t>
       </w:r>
     </w:p>
     <w:p>
@@ -10961,15 +10697,7 @@
       </w:r>
       <w:proofErr w:type="spellEnd"/>
       <w:r>
-        <w:t xml:space="preserve"> (</w:t>
-      </w:r>
-      <w:proofErr w:type="spellStart"/>
-      <w:r>
-        <w:t>FK</w:t>
-      </w:r>
-      <w:proofErr w:type="spellEnd"/>
-      <w:r>
-        <w:t>)</w:t>
+        <w:t xml:space="preserve"> (FK)</w:t>
       </w:r>
     </w:p>
     <w:p>
@@ -11343,6 +11071,232 @@
       </w:r>
       <w:bookmarkEnd w:id="24"/>
     </w:p>
+    <w:p/>
+    <w:p>
+      <w:r>
+        <w:drawing>
+          <wp:inline distT="0" distB="0" distL="0" distR="0" wp14:anchorId="4671F5DE" wp14:editId="249DD0DE">
+            <wp:extent cx="6120130" cy="3509010"/>
+            <wp:effectExtent l="0" t="0" r="0" b="0"/>
+            <wp:docPr id="1617025627" name="Imagen 1"/>
+            <wp:cNvGraphicFramePr>
+              <a:graphicFrameLocks xmlns:a="http://schemas.openxmlformats.org/drawingml/2006/main" noChangeAspect="1"/>
+            </wp:cNvGraphicFramePr>
+            <a:graphic xmlns:a="http://schemas.openxmlformats.org/drawingml/2006/main">
+              <a:graphicData uri="http://schemas.openxmlformats.org/drawingml/2006/picture">
+                <pic:pic xmlns:pic="http://schemas.openxmlformats.org/drawingml/2006/picture">
+                  <pic:nvPicPr>
+                    <pic:cNvPr id="1617025627" name=""/>
+                    <pic:cNvPicPr/>
+                  </pic:nvPicPr>
+                  <pic:blipFill>
+                    <a:blip r:embed="rId19"/>
+                    <a:stretch>
+                      <a:fillRect/>
+                    </a:stretch>
+                  </pic:blipFill>
+                  <pic:spPr>
+                    <a:xfrm>
+                      <a:off x="0" y="0"/>
+                      <a:ext cx="6120130" cy="3509010"/>
+                    </a:xfrm>
+                    <a:prstGeom prst="rect">
+                      <a:avLst/>
+                    </a:prstGeom>
+                  </pic:spPr>
+                </pic:pic>
+              </a:graphicData>
+            </a:graphic>
+          </wp:inline>
+        </w:drawing>
+      </w:r>
+    </w:p>
+    <w:p>
+      <w:r>
+        <w:t xml:space="preserve">Interfaz de Bienvenida que se muestra al usuario al arrancar la apliación </w:t>
+      </w:r>
+      <w:proofErr w:type="gramStart"/>
+      <w:r>
+        <w:t>y  desde</w:t>
+      </w:r>
+      <w:proofErr w:type="gramEnd"/>
+      <w:r>
+        <w:t xml:space="preserve"> la cual nos logearemos en el sistema</w:t>
+      </w:r>
+    </w:p>
+    <w:p/>
+    <w:p>
+      <w:r>
+        <w:drawing>
+          <wp:inline distT="0" distB="0" distL="0" distR="0" wp14:anchorId="15C6B61C" wp14:editId="034506A7">
+            <wp:extent cx="2700073" cy="3193415"/>
+            <wp:effectExtent l="0" t="0" r="5080" b="6985"/>
+            <wp:docPr id="2056988336" name="Imagen 1"/>
+            <wp:cNvGraphicFramePr>
+              <a:graphicFrameLocks xmlns:a="http://schemas.openxmlformats.org/drawingml/2006/main" noChangeAspect="1"/>
+            </wp:cNvGraphicFramePr>
+            <a:graphic xmlns:a="http://schemas.openxmlformats.org/drawingml/2006/main">
+              <a:graphicData uri="http://schemas.openxmlformats.org/drawingml/2006/picture">
+                <pic:pic xmlns:pic="http://schemas.openxmlformats.org/drawingml/2006/picture">
+                  <pic:nvPicPr>
+                    <pic:cNvPr id="2056988336" name=""/>
+                    <pic:cNvPicPr/>
+                  </pic:nvPicPr>
+                  <pic:blipFill>
+                    <a:blip r:embed="rId20"/>
+                    <a:stretch>
+                      <a:fillRect/>
+                    </a:stretch>
+                  </pic:blipFill>
+                  <pic:spPr>
+                    <a:xfrm>
+                      <a:off x="0" y="0"/>
+                      <a:ext cx="2706626" cy="3201165"/>
+                    </a:xfrm>
+                    <a:prstGeom prst="rect">
+                      <a:avLst/>
+                    </a:prstGeom>
+                  </pic:spPr>
+                </pic:pic>
+              </a:graphicData>
+            </a:graphic>
+          </wp:inline>
+        </w:drawing>
+      </w:r>
+    </w:p>
+    <w:p/>
+    <w:p>
+      <w:r>
+        <w:t xml:space="preserve">Interfaz </w:t>
+      </w:r>
+      <w:proofErr w:type="gramStart"/>
+      <w:r>
+        <w:t>de  inicio</w:t>
+      </w:r>
+      <w:proofErr w:type="gramEnd"/>
+      <w:r>
+        <w:t xml:space="preserve"> sesión desde la cual nos logeremos en el sistema y también podremos recuperar nuestra contraseña</w:t>
+      </w:r>
+    </w:p>
+    <w:p/>
+    <w:p/>
+    <w:p>
+      <w:r>
+        <w:drawing>
+          <wp:inline distT="0" distB="0" distL="0" distR="0" wp14:anchorId="68B8F6C6" wp14:editId="1E8EDC45">
+            <wp:extent cx="2896181" cy="3080385"/>
+            <wp:effectExtent l="0" t="0" r="0" b="5715"/>
+            <wp:docPr id="1285327052" name="Imagen 1"/>
+            <wp:cNvGraphicFramePr>
+              <a:graphicFrameLocks xmlns:a="http://schemas.openxmlformats.org/drawingml/2006/main" noChangeAspect="1"/>
+            </wp:cNvGraphicFramePr>
+            <a:graphic xmlns:a="http://schemas.openxmlformats.org/drawingml/2006/main">
+              <a:graphicData uri="http://schemas.openxmlformats.org/drawingml/2006/picture">
+                <pic:pic xmlns:pic="http://schemas.openxmlformats.org/drawingml/2006/picture">
+                  <pic:nvPicPr>
+                    <pic:cNvPr id="1285327052" name=""/>
+                    <pic:cNvPicPr/>
+                  </pic:nvPicPr>
+                  <pic:blipFill>
+                    <a:blip r:embed="rId21"/>
+                    <a:stretch>
+                      <a:fillRect/>
+                    </a:stretch>
+                  </pic:blipFill>
+                  <pic:spPr>
+                    <a:xfrm>
+                      <a:off x="0" y="0"/>
+                      <a:ext cx="2908550" cy="3093541"/>
+                    </a:xfrm>
+                    <a:prstGeom prst="rect">
+                      <a:avLst/>
+                    </a:prstGeom>
+                  </pic:spPr>
+                </pic:pic>
+              </a:graphicData>
+            </a:graphic>
+          </wp:inline>
+        </w:drawing>
+      </w:r>
+    </w:p>
+    <w:p/>
+    <w:p>
+      <w:r>
+        <w:t xml:space="preserve">Panel del usuario administrador desde aquí podremos gestionar </w:t>
+      </w:r>
+      <w:proofErr w:type="gramStart"/>
+      <w:r>
+        <w:t>profesores ,</w:t>
+      </w:r>
+      <w:proofErr w:type="gramEnd"/>
+      <w:r>
+        <w:t xml:space="preserve"> gestionar </w:t>
+      </w:r>
+      <w:proofErr w:type="gramStart"/>
+      <w:r>
+        <w:t>cursos ,</w:t>
+      </w:r>
+      <w:proofErr w:type="gramEnd"/>
+      <w:r>
+        <w:t xml:space="preserve"> gestionar </w:t>
+      </w:r>
+      <w:proofErr w:type="gramStart"/>
+      <w:r>
+        <w:t>grupos ,</w:t>
+      </w:r>
+      <w:proofErr w:type="gramEnd"/>
+      <w:r>
+        <w:t xml:space="preserve"> gestionar </w:t>
+      </w:r>
+      <w:proofErr w:type="gramStart"/>
+      <w:r>
+        <w:t>estudiantes ,</w:t>
+      </w:r>
+      <w:proofErr w:type="gramEnd"/>
+      <w:r>
+        <w:t xml:space="preserve"> gestionar </w:t>
+      </w:r>
+      <w:proofErr w:type="gramStart"/>
+      <w:r>
+        <w:t>empresas ,</w:t>
+      </w:r>
+      <w:proofErr w:type="gramEnd"/>
+      <w:r>
+        <w:t xml:space="preserve"> gestionar tutores de </w:t>
+      </w:r>
+      <w:proofErr w:type="gramStart"/>
+      <w:r>
+        <w:t>empresa  ,</w:t>
+      </w:r>
+      <w:proofErr w:type="gramEnd"/>
+      <w:r>
+        <w:t xml:space="preserve"> gestionar empresas y así como cerrar sesión para deslogearnos del sistema</w:t>
+      </w:r>
+    </w:p>
+    <w:p/>
+    <w:p/>
+    <w:p/>
+    <w:p/>
+    <w:p/>
+    <w:p/>
+    <w:p/>
+    <w:p>
+      <w:r>
+        <w:t xml:space="preserve">  </w:t>
+      </w:r>
+    </w:p>
+    <w:p/>
+    <w:p/>
+    <w:p/>
+    <w:p/>
+    <w:p/>
+    <w:p>
+      <w:r>
+        <w:t xml:space="preserve"> </w:t>
+      </w:r>
+    </w:p>
+    <w:p/>
+    <w:p/>
     <w:p>
       <w:r>
         <w:t>(…)</w:t>
@@ -11757,7 +11711,7 @@
       <w:r>
         <w:t xml:space="preserve">Web CIP La Laboral. Oferta formativa del departamento de Informática y Comunicaciones. </w:t>
       </w:r>
-      <w:hyperlink r:id="rId19" w:history="1">
+      <w:hyperlink r:id="rId22" w:history="1">
         <w:r>
           <w:rPr>
             <w:rStyle w:val="Hipervnculo"/>
@@ -11773,7 +11727,7 @@
       </w:r>
     </w:p>
     <w:sectPr>
-      <w:footerReference w:type="default" r:id="rId20"/>
+      <w:footerReference w:type="default" r:id="rId23"/>
       <w:pgSz w:w="11906" w:h="16838"/>
       <w:pgMar w:top="1134" w:right="1134" w:bottom="1418" w:left="1134" w:header="709" w:footer="709" w:gutter="0"/>
       <w:pgNumType w:start="1"/>
@@ -22198,6 +22152,12 @@
 </file>
 
 <file path=customXml/item1.xml><?xml version="1.0" encoding="utf-8"?>
+<p:properties xmlns:p="http://schemas.microsoft.com/office/2006/metadata/properties" xmlns:xsi="http://www.w3.org/2001/XMLSchema-instance" xmlns:pc="http://schemas.microsoft.com/office/infopath/2007/PartnerControls">
+  <documentManagement/>
+</p:properties>
+</file>
+
+<file path=customXml/item2.xml><?xml version="1.0" encoding="utf-8"?>
 <ct:contentTypeSchema xmlns:ct="http://schemas.microsoft.com/office/2006/metadata/contentType" xmlns:ma="http://schemas.microsoft.com/office/2006/metadata/properties/metaAttributes" ct:_="" ma:_="" ma:contentTypeName="Documento" ma:contentTypeID="0x0101003E64B964EE86E94E88810388061E4AC8" ma:contentTypeVersion="3" ma:contentTypeDescription="Crear nuevo documento." ma:contentTypeScope="" ma:versionID="3c755de4efb81f0959f76dfe4f7a563c">
   <xsd:schema xmlns:xsd="http://www.w3.org/2001/XMLSchema" xmlns:xs="http://www.w3.org/2001/XMLSchema" xmlns:p="http://schemas.microsoft.com/office/2006/metadata/properties" xmlns:ns2="72982a07-b385-426f-8f99-a9bd2486cbec" targetNamespace="http://schemas.microsoft.com/office/2006/metadata/properties" ma:root="true" ma:fieldsID="5f645ab2d71ed821d1fb93c6441734aa" ns2:_="">
     <xsd:import namespace="72982a07-b385-426f-8f99-a9bd2486cbec"/>
@@ -22335,13 +22295,11 @@
 </ct:contentTypeSchema>
 </file>
 
-<file path=customXml/item2.xml><?xml version="1.0" encoding="utf-8"?>
-<p:properties xmlns:p="http://schemas.microsoft.com/office/2006/metadata/properties" xmlns:xsi="http://www.w3.org/2001/XMLSchema-instance" xmlns:pc="http://schemas.microsoft.com/office/infopath/2007/PartnerControls">
-  <documentManagement/>
-</p:properties>
+<file path=customXml/item3.xml><?xml version="1.0" encoding="utf-8"?>
+<b:Sources xmlns:b="http://schemas.openxmlformats.org/officeDocument/2006/bibliography" xmlns="http://schemas.openxmlformats.org/officeDocument/2006/bibliography" SelectedStyle="\APASixthEditionOfficeOnline.xsl" StyleName="APA" Version="6"/>
 </file>
 
-<file path=customXml/item3.xml><?xml version="1.0" encoding="utf-8"?>
+<file path=customXml/item4.xml><?xml version="1.0" encoding="utf-8"?>
 <?mso-contentType ?>
 <FormTemplates xmlns="http://schemas.microsoft.com/sharepoint/v3/contenttype/forms">
   <Display>DocumentLibraryForm</Display>
@@ -22350,11 +22308,16 @@
 </FormTemplates>
 </file>
 
-<file path=customXml/item4.xml><?xml version="1.0" encoding="utf-8"?>
-<b:Sources xmlns:b="http://schemas.openxmlformats.org/officeDocument/2006/bibliography" xmlns="http://schemas.openxmlformats.org/officeDocument/2006/bibliography" SelectedStyle="\APASixthEditionOfficeOnline.xsl" StyleName="APA" Version="6"/>
+<file path=customXml/itemProps1.xml><?xml version="1.0" encoding="utf-8"?>
+<ds:datastoreItem xmlns:ds="http://schemas.openxmlformats.org/officeDocument/2006/customXml" ds:itemID="{7F0B1298-25D5-45B9-909D-DD837044A49E}">
+  <ds:schemaRefs>
+    <ds:schemaRef ds:uri="http://schemas.microsoft.com/office/2006/metadata/properties"/>
+    <ds:schemaRef ds:uri="http://schemas.microsoft.com/office/infopath/2007/PartnerControls"/>
+  </ds:schemaRefs>
+</ds:datastoreItem>
 </file>
 
-<file path=customXml/itemProps1.xml><?xml version="1.0" encoding="utf-8"?>
+<file path=customXml/itemProps2.xml><?xml version="1.0" encoding="utf-8"?>
 <ds:datastoreItem xmlns:ds="http://schemas.openxmlformats.org/officeDocument/2006/customXml" ds:itemID="{CAB20FFE-1E23-4B58-9D76-1835AB7D3BED}">
   <ds:schemaRefs>
     <ds:schemaRef ds:uri="http://schemas.microsoft.com/office/2006/metadata/contentType"/>
@@ -22372,27 +22335,18 @@
 </ds:datastoreItem>
 </file>
 
-<file path=customXml/itemProps2.xml><?xml version="1.0" encoding="utf-8"?>
-<ds:datastoreItem xmlns:ds="http://schemas.openxmlformats.org/officeDocument/2006/customXml" ds:itemID="{7F0B1298-25D5-45B9-909D-DD837044A49E}">
+<file path=customXml/itemProps3.xml><?xml version="1.0" encoding="utf-8"?>
+<ds:datastoreItem xmlns:ds="http://schemas.openxmlformats.org/officeDocument/2006/customXml" ds:itemID="{BDF99D19-6C5D-43D5-B443-C33B3ADCE9C1}">
   <ds:schemaRefs>
-    <ds:schemaRef ds:uri="http://schemas.microsoft.com/office/2006/metadata/properties"/>
-    <ds:schemaRef ds:uri="http://schemas.microsoft.com/office/infopath/2007/PartnerControls"/>
+    <ds:schemaRef ds:uri="http://schemas.openxmlformats.org/officeDocument/2006/bibliography"/>
   </ds:schemaRefs>
 </ds:datastoreItem>
 </file>
 
-<file path=customXml/itemProps3.xml><?xml version="1.0" encoding="utf-8"?>
+<file path=customXml/itemProps4.xml><?xml version="1.0" encoding="utf-8"?>
 <ds:datastoreItem xmlns:ds="http://schemas.openxmlformats.org/officeDocument/2006/customXml" ds:itemID="{480B8420-1B48-4D23-8D6E-64373AC5070B}">
   <ds:schemaRefs>
     <ds:schemaRef ds:uri="http://schemas.microsoft.com/sharepoint/v3/contenttype/forms"/>
   </ds:schemaRefs>
 </ds:datastoreItem>
-</file>
-
-<file path=customXml/itemProps4.xml><?xml version="1.0" encoding="utf-8"?>
-<ds:datastoreItem xmlns:ds="http://schemas.openxmlformats.org/officeDocument/2006/customXml" ds:itemID="{BDF99D19-6C5D-43D5-B443-C33B3ADCE9C1}">
-  <ds:schemaRefs>
-    <ds:schemaRef ds:uri="http://schemas.openxmlformats.org/officeDocument/2006/bibliography"/>
-  </ds:schemaRefs>
-</ds:datastoreItem>
 </file>
</xml_diff>

<commit_message>
Cambios  realizados en el Proyecta
</commit_message>
<xml_diff>
--- a/PROYECTO_MATEOSRAMOS_OSCAR/docu/DocumentacionProyectoOscarMateosRamos_2VIFC302.docx
+++ b/PROYECTO_MATEOSRAMOS_OSCAR/docu/DocumentacionProyectoOscarMateosRamos_2VIFC302.docx
@@ -6778,8 +6778,6 @@
       <w:r>
         <w:t>CU07 – Modificar datos propios</w:t>
       </w:r>
-    </w:p>
-    <w:p>
       <w:r>
         <w:t>CU08 – Gestionar empresas</w:t>
       </w:r>
@@ -6879,24 +6877,12 @@
       <w:bookmarkEnd w:id="14"/>
     </w:p>
     <w:p>
-      <w:pPr>
-        <w:keepNext/>
-      </w:pPr>
-      <w:r>
-        <w:rPr>
-          <w:noProof/>
-        </w:rPr>
-        <w:t xml:space="preserve">                   </w:t>
-      </w:r>
-      <w:r>
-        <w:rPr>
-          <w:noProof/>
-        </w:rPr>
+      <w:r>
         <w:drawing>
-          <wp:inline distT="0" distB="0" distL="0" distR="0" wp14:anchorId="71A9C0BB" wp14:editId="6EB22D82">
-            <wp:extent cx="6120130" cy="3154680"/>
-            <wp:effectExtent l="0" t="0" r="0" b="7620"/>
-            <wp:docPr id="350987127" name="Imagen 1"/>
+          <wp:inline distT="0" distB="0" distL="0" distR="0" wp14:anchorId="0C074B9C" wp14:editId="2C640A0B">
+            <wp:extent cx="6120130" cy="3416935"/>
+            <wp:effectExtent l="0" t="0" r="0" b="0"/>
+            <wp:docPr id="1402697258" name="Imagen 1"/>
             <wp:cNvGraphicFramePr>
               <a:graphicFrameLocks xmlns:a="http://schemas.openxmlformats.org/drawingml/2006/main" noChangeAspect="1"/>
             </wp:cNvGraphicFramePr>
@@ -6904,7 +6890,7 @@
               <a:graphicData uri="http://schemas.openxmlformats.org/drawingml/2006/picture">
                 <pic:pic xmlns:pic="http://schemas.openxmlformats.org/drawingml/2006/picture">
                   <pic:nvPicPr>
-                    <pic:cNvPr id="350987127" name=""/>
+                    <pic:cNvPr id="1402697258" name=""/>
                     <pic:cNvPicPr/>
                   </pic:nvPicPr>
                   <pic:blipFill>
@@ -6916,7 +6902,7 @@
                   <pic:spPr>
                     <a:xfrm>
                       <a:off x="0" y="0"/>
-                      <a:ext cx="6120130" cy="3154680"/>
+                      <a:ext cx="6120130" cy="3416935"/>
                     </a:xfrm>
                     <a:prstGeom prst="rect">
                       <a:avLst/>
@@ -6927,6 +6913,17 @@
             </a:graphic>
           </wp:inline>
         </w:drawing>
+      </w:r>
+    </w:p>
+    <w:p>
+      <w:pPr>
+        <w:keepNext/>
+      </w:pPr>
+      <w:r>
+        <w:rPr>
+          <w:noProof/>
+        </w:rPr>
+        <w:t xml:space="preserve">                   </w:t>
       </w:r>
     </w:p>
     <w:p>
@@ -7319,7 +7316,7 @@
                 <w:sz w:val="20"/>
                 <w:szCs w:val="20"/>
               </w:rPr>
-              <w:t>Estudiantes</w:t>
+              <w:t>Estudiante</w:t>
             </w:r>
           </w:p>
         </w:tc>
@@ -7771,6 +7768,242 @@
     </w:p>
     <w:p>
       <w:pPr>
+        <w:tabs>
+          <w:tab w:val="num" w:pos="360"/>
+        </w:tabs>
+        <w:ind w:left="360"/>
+        <w:rPr>
+          <w:b/>
+          <w:bCs/>
+        </w:rPr>
+      </w:pPr>
+      <w:r>
+        <w:rPr>
+          <w:b/>
+          <w:bCs/>
+        </w:rPr>
+        <w:t>CU0</w:t>
+      </w:r>
+      <w:r>
+        <w:rPr>
+          <w:b/>
+          <w:bCs/>
+        </w:rPr>
+        <w:t>5</w:t>
+      </w:r>
+      <w:r>
+        <w:rPr>
+          <w:b/>
+          <w:bCs/>
+        </w:rPr>
+        <w:t xml:space="preserve"> – Gestionar estudiantes</w:t>
+      </w:r>
+    </w:p>
+    <w:p>
+      <w:r>
+        <w:rPr>
+          <w:b/>
+          <w:bCs/>
+        </w:rPr>
+        <w:t>Actor:</w:t>
+      </w:r>
+      <w:r>
+        <w:t xml:space="preserve"> Administrador, Profesor tutor </w:t>
+      </w:r>
+      <w:r>
+        <w:rPr>
+          <w:b/>
+          <w:bCs/>
+        </w:rPr>
+        <w:t>Descripción:</w:t>
+      </w:r>
+      <w:r>
+        <w:t xml:space="preserve"> Alta, baja, modificación y consulta de estudiantes. </w:t>
+      </w:r>
+      <w:r>
+        <w:rPr>
+          <w:b/>
+          <w:bCs/>
+        </w:rPr>
+        <w:t>Precondiciones:</w:t>
+      </w:r>
+      <w:r>
+        <w:t xml:space="preserve"> Sesión iniciada como administrador o profesor tutor. </w:t>
+      </w:r>
+      <w:r>
+        <w:rPr>
+          <w:b/>
+          <w:bCs/>
+        </w:rPr>
+        <w:t>Flujo principal:</w:t>
+      </w:r>
+    </w:p>
+    <w:p>
+      <w:pPr>
+        <w:numPr>
+          <w:ilvl w:val="0"/>
+          <w:numId w:val="52"/>
+        </w:numPr>
+      </w:pPr>
+      <w:r>
+        <w:t>Seleccionar acción (alta/baja/modificar/consultar).</w:t>
+      </w:r>
+    </w:p>
+    <w:p>
+      <w:pPr>
+        <w:numPr>
+          <w:ilvl w:val="0"/>
+          <w:numId w:val="52"/>
+        </w:numPr>
+      </w:pPr>
+      <w:r>
+        <w:t>Introducir o editar datos.</w:t>
+      </w:r>
+    </w:p>
+    <w:p>
+      <w:pPr>
+        <w:numPr>
+          <w:ilvl w:val="0"/>
+          <w:numId w:val="52"/>
+        </w:numPr>
+      </w:pPr>
+      <w:r>
+        <w:t xml:space="preserve">Confirmar operación. </w:t>
+      </w:r>
+      <w:r>
+        <w:rPr>
+          <w:b/>
+          <w:bCs/>
+        </w:rPr>
+        <w:t>Postcondiciones:</w:t>
+      </w:r>
+      <w:r>
+        <w:t xml:space="preserve"> Los datos del estudiante quedan actualizados.</w:t>
+      </w:r>
+    </w:p>
+    <w:p>
+      <w:pPr>
+        <w:tabs>
+          <w:tab w:val="num" w:pos="360"/>
+        </w:tabs>
+        <w:ind w:left="360"/>
+        <w:rPr>
+          <w:b/>
+          <w:bCs/>
+        </w:rPr>
+      </w:pPr>
+      <w:r>
+        <w:rPr>
+          <w:b/>
+          <w:bCs/>
+        </w:rPr>
+        <w:t>CU0</w:t>
+      </w:r>
+      <w:r>
+        <w:rPr>
+          <w:b/>
+          <w:bCs/>
+        </w:rPr>
+        <w:t>6</w:t>
+      </w:r>
+      <w:r>
+        <w:rPr>
+          <w:b/>
+          <w:bCs/>
+        </w:rPr>
+        <w:t xml:space="preserve"> – Modificar datos propios</w:t>
+      </w:r>
+    </w:p>
+    <w:p>
+      <w:r>
+        <w:rPr>
+          <w:b/>
+          <w:bCs/>
+        </w:rPr>
+        <w:t>Actor:</w:t>
+      </w:r>
+      <w:r>
+        <w:t xml:space="preserve"> </w:t>
+      </w:r>
+      <w:r>
+        <w:t>Estudiante</w:t>
+      </w:r>
+      <w:r>
+        <w:t xml:space="preserve">, Profesor tutor, Tutor de empresa, Estudiante </w:t>
+      </w:r>
+      <w:r>
+        <w:rPr>
+          <w:b/>
+          <w:bCs/>
+        </w:rPr>
+        <w:t>Descripción:</w:t>
+      </w:r>
+      <w:r>
+        <w:t xml:space="preserve"> Permite modificar ciertos datos personales según el rol. </w:t>
+      </w:r>
+      <w:r>
+        <w:rPr>
+          <w:b/>
+          <w:bCs/>
+        </w:rPr>
+        <w:t>Precondiciones:</w:t>
+      </w:r>
+      <w:r>
+        <w:t xml:space="preserve"> Sesión iniciada. </w:t>
+      </w:r>
+      <w:r>
+        <w:rPr>
+          <w:b/>
+          <w:bCs/>
+        </w:rPr>
+        <w:t>Flujo principal:</w:t>
+      </w:r>
+    </w:p>
+    <w:p>
+      <w:pPr>
+        <w:numPr>
+          <w:ilvl w:val="0"/>
+          <w:numId w:val="53"/>
+        </w:numPr>
+      </w:pPr>
+      <w:r>
+        <w:t>Acceder a “Mis datos”.</w:t>
+      </w:r>
+    </w:p>
+    <w:p>
+      <w:pPr>
+        <w:numPr>
+          <w:ilvl w:val="0"/>
+          <w:numId w:val="53"/>
+        </w:numPr>
+      </w:pPr>
+      <w:r>
+        <w:t>Editar campos permitidos.</w:t>
+      </w:r>
+    </w:p>
+    <w:p>
+      <w:pPr>
+        <w:numPr>
+          <w:ilvl w:val="0"/>
+          <w:numId w:val="53"/>
+        </w:numPr>
+      </w:pPr>
+      <w:r>
+        <w:t xml:space="preserve">Guardar cambios. </w:t>
+      </w:r>
+      <w:r>
+        <w:rPr>
+          <w:b/>
+          <w:bCs/>
+        </w:rPr>
+        <w:t>Postcondiciones:</w:t>
+      </w:r>
+      <w:r>
+        <w:t xml:space="preserve"> Datos personales actualizados.</w:t>
+      </w:r>
+    </w:p>
+    <w:p>
+      <w:pPr>
         <w:numPr>
           <w:ilvl w:val="0"/>
           <w:numId w:val="22"/>
@@ -7788,7 +8021,7 @@
           <w:b/>
           <w:bCs/>
         </w:rPr>
-        <w:t>CU05 – Asociar tutor a curso</w:t>
+        <w:t>CU08 – Gestionar empresas</w:t>
       </w:r>
     </w:p>
     <w:p>
@@ -7800,7 +8033,7 @@
         <w:t>Actor:</w:t>
       </w:r>
       <w:r>
-        <w:t xml:space="preserve"> Administrador </w:t>
+        <w:t xml:space="preserve"> Administrador, Profesor tutor </w:t>
       </w:r>
       <w:r>
         <w:rPr>
@@ -7810,7 +8043,7 @@
         <w:t>Descripción:</w:t>
       </w:r>
       <w:r>
-        <w:t xml:space="preserve"> Asocia un tutor del centro a un curso. </w:t>
+        <w:t xml:space="preserve"> Alta, baja, modificación y consulta de empresas colaboradoras. </w:t>
       </w:r>
       <w:r>
         <w:rPr>
@@ -7820,7 +8053,7 @@
         <w:t>Precondiciones:</w:t>
       </w:r>
       <w:r>
-        <w:t xml:space="preserve"> Deben existir tutor y curso. </w:t>
+        <w:t xml:space="preserve"> Sesión iniciada como administrador o profesor tutor. </w:t>
       </w:r>
       <w:r>
         <w:rPr>
@@ -7834,33 +8067,33 @@
       <w:pPr>
         <w:numPr>
           <w:ilvl w:val="0"/>
-          <w:numId w:val="51"/>
+          <w:numId w:val="54"/>
         </w:numPr>
       </w:pPr>
       <w:r>
-        <w:t>Seleccionar curso.</w:t>
+        <w:t>Seleccionar acción.</w:t>
       </w:r>
     </w:p>
     <w:p>
       <w:pPr>
         <w:numPr>
           <w:ilvl w:val="0"/>
-          <w:numId w:val="51"/>
+          <w:numId w:val="54"/>
         </w:numPr>
       </w:pPr>
       <w:r>
-        <w:t>Seleccionar tutor.</w:t>
+        <w:t>Introducir o editar datos.</w:t>
       </w:r>
     </w:p>
     <w:p>
       <w:pPr>
         <w:numPr>
           <w:ilvl w:val="0"/>
-          <w:numId w:val="51"/>
+          <w:numId w:val="54"/>
         </w:numPr>
       </w:pPr>
       <w:r>
-        <w:t xml:space="preserve">Confirmar asociación. </w:t>
+        <w:t xml:space="preserve">Confirmar operación. </w:t>
       </w:r>
       <w:r>
         <w:rPr>
@@ -7870,7 +8103,7 @@
         <w:t>Postcondiciones:</w:t>
       </w:r>
       <w:r>
-        <w:t xml:space="preserve"> El tutor queda vinculado al curso.</w:t>
+        <w:t xml:space="preserve"> Empresa registrada o actualizada.</w:t>
       </w:r>
     </w:p>
     <w:p>
@@ -7892,7 +8125,7 @@
           <w:b/>
           <w:bCs/>
         </w:rPr>
-        <w:t>CU06 – Gestionar estudiantes</w:t>
+        <w:t>CU09 – Gestionar tutores de empresa</w:t>
       </w:r>
     </w:p>
     <w:p>
@@ -7914,7 +8147,7 @@
         <w:t>Descripción:</w:t>
       </w:r>
       <w:r>
-        <w:t xml:space="preserve"> Alta, baja, modificación y consulta de estudiantes. </w:t>
+        <w:t xml:space="preserve"> Alta, baja, modificación y consulta de tutores de empresa. </w:t>
       </w:r>
       <w:r>
         <w:rPr>
@@ -7924,7 +8157,7 @@
         <w:t>Precondiciones:</w:t>
       </w:r>
       <w:r>
-        <w:t xml:space="preserve"> Sesión iniciada como administrador o profesor tutor. </w:t>
+        <w:t xml:space="preserve"> Debe existir la empresa asociada. </w:t>
       </w:r>
       <w:r>
         <w:rPr>
@@ -7938,33 +8171,33 @@
       <w:pPr>
         <w:numPr>
           <w:ilvl w:val="0"/>
-          <w:numId w:val="52"/>
+          <w:numId w:val="55"/>
         </w:numPr>
       </w:pPr>
       <w:r>
-        <w:t>Seleccionar acción (alta/baja/modificar/consultar).</w:t>
+        <w:t>Seleccionar empresa.</w:t>
       </w:r>
     </w:p>
     <w:p>
       <w:pPr>
         <w:numPr>
           <w:ilvl w:val="0"/>
-          <w:numId w:val="52"/>
+          <w:numId w:val="55"/>
         </w:numPr>
       </w:pPr>
       <w:r>
-        <w:t>Introducir o editar datos.</w:t>
+        <w:t>Añadir o modificar tutor.</w:t>
       </w:r>
     </w:p>
     <w:p>
       <w:pPr>
         <w:numPr>
           <w:ilvl w:val="0"/>
-          <w:numId w:val="52"/>
+          <w:numId w:val="55"/>
         </w:numPr>
       </w:pPr>
       <w:r>
-        <w:t xml:space="preserve">Confirmar operación. </w:t>
+        <w:t xml:space="preserve">Guardar cambios. </w:t>
       </w:r>
       <w:r>
         <w:rPr>
@@ -7974,7 +8207,267 @@
         <w:t>Postcondiciones:</w:t>
       </w:r>
       <w:r>
-        <w:t xml:space="preserve"> Los datos del estudiante quedan actualizados.</w:t>
+        <w:t xml:space="preserve"> Tutor de empresa registrado o actualizado.</w:t>
+      </w:r>
+    </w:p>
+    <w:p>
+      <w:pPr>
+        <w:tabs>
+          <w:tab w:val="num" w:pos="360"/>
+        </w:tabs>
+        <w:ind w:left="360"/>
+        <w:rPr>
+          <w:b/>
+          <w:bCs/>
+        </w:rPr>
+      </w:pPr>
+    </w:p>
+    <w:p>
+      <w:pPr>
+        <w:tabs>
+          <w:tab w:val="num" w:pos="360"/>
+        </w:tabs>
+        <w:ind w:left="360"/>
+        <w:rPr>
+          <w:b/>
+          <w:bCs/>
+        </w:rPr>
+      </w:pPr>
+      <w:r>
+        <w:rPr>
+          <w:b/>
+          <w:bCs/>
+        </w:rPr>
+        <w:t>CU</w:t>
+      </w:r>
+      <w:r>
+        <w:rPr>
+          <w:b/>
+          <w:bCs/>
+        </w:rPr>
+        <w:t>10</w:t>
+      </w:r>
+      <w:r>
+        <w:rPr>
+          <w:b/>
+          <w:bCs/>
+        </w:rPr>
+        <w:t xml:space="preserve"> – </w:t>
+      </w:r>
+      <w:proofErr w:type="gramStart"/>
+      <w:r>
+        <w:rPr>
+          <w:b/>
+          <w:bCs/>
+        </w:rPr>
+        <w:t xml:space="preserve">Gestionar </w:t>
+      </w:r>
+      <w:r>
+        <w:rPr>
+          <w:b/>
+          <w:bCs/>
+        </w:rPr>
+        <w:t xml:space="preserve"> Formaciones</w:t>
+      </w:r>
+      <w:proofErr w:type="gramEnd"/>
+    </w:p>
+    <w:p>
+      <w:r>
+        <w:rPr>
+          <w:b/>
+          <w:bCs/>
+        </w:rPr>
+        <w:t>Actor:</w:t>
+      </w:r>
+      <w:r>
+        <w:t xml:space="preserve"> Administrador </w:t>
+      </w:r>
+      <w:r>
+        <w:rPr>
+          <w:b/>
+          <w:bCs/>
+        </w:rPr>
+        <w:t>Descripción:</w:t>
+      </w:r>
+      <w:r>
+        <w:t xml:space="preserve"> Alta, baja, modificación</w:t>
+      </w:r>
+      <w:r>
+        <w:t xml:space="preserve"> de formaciones en empresa</w:t>
+      </w:r>
+      <w:r>
+        <w:t xml:space="preserve">.  </w:t>
+      </w:r>
+      <w:r>
+        <w:rPr>
+          <w:b/>
+          <w:bCs/>
+        </w:rPr>
+        <w:t>Flujo principal:</w:t>
+      </w:r>
+    </w:p>
+    <w:p>
+      <w:pPr>
+        <w:numPr>
+          <w:ilvl w:val="0"/>
+          <w:numId w:val="55"/>
+        </w:numPr>
+      </w:pPr>
+      <w:r>
+        <w:t xml:space="preserve">Si quieres añadir una nueva formación le das a nuevo y rellenas el formulario con los datos que hay </w:t>
+      </w:r>
+    </w:p>
+    <w:p>
+      <w:pPr>
+        <w:numPr>
+          <w:ilvl w:val="0"/>
+          <w:numId w:val="55"/>
+        </w:numPr>
+      </w:pPr>
+      <w:proofErr w:type="gramStart"/>
+      <w:r>
+        <w:t>Si  quieres</w:t>
+      </w:r>
+      <w:proofErr w:type="gramEnd"/>
+      <w:r>
+        <w:t xml:space="preserve"> editar una formación la seleccionas y cambias lo que quieras y le das a guardar</w:t>
+      </w:r>
+    </w:p>
+    <w:p>
+      <w:pPr>
+        <w:numPr>
+          <w:ilvl w:val="0"/>
+          <w:numId w:val="55"/>
+        </w:numPr>
+      </w:pPr>
+      <w:proofErr w:type="gramStart"/>
+      <w:r>
+        <w:t>Si  quieres</w:t>
+      </w:r>
+      <w:proofErr w:type="gramEnd"/>
+      <w:r>
+        <w:t xml:space="preserve"> e</w:t>
+      </w:r>
+      <w:r>
+        <w:t xml:space="preserve">liminar una formación seleccionas una formación y le das a eliminar </w:t>
+      </w:r>
+    </w:p>
+    <w:p>
+      <w:pPr>
+        <w:ind w:left="720"/>
+      </w:pPr>
+    </w:p>
+    <w:p>
+      <w:pPr>
+        <w:tabs>
+          <w:tab w:val="num" w:pos="360"/>
+        </w:tabs>
+        <w:ind w:left="360"/>
+        <w:rPr>
+          <w:b/>
+          <w:bCs/>
+        </w:rPr>
+      </w:pPr>
+    </w:p>
+    <w:p>
+      <w:pPr>
+        <w:tabs>
+          <w:tab w:val="num" w:pos="360"/>
+        </w:tabs>
+        <w:ind w:left="360"/>
+        <w:rPr>
+          <w:b/>
+          <w:bCs/>
+        </w:rPr>
+      </w:pPr>
+      <w:r>
+        <w:rPr>
+          <w:b/>
+          <w:bCs/>
+        </w:rPr>
+        <w:t>CU11 – Registrar nueva asignación por devolución</w:t>
+      </w:r>
+    </w:p>
+    <w:p>
+      <w:r>
+        <w:rPr>
+          <w:b/>
+          <w:bCs/>
+        </w:rPr>
+        <w:t>Actor:</w:t>
+      </w:r>
+      <w:r>
+        <w:t xml:space="preserve"> Administrador, Profesor tutor </w:t>
+      </w:r>
+      <w:r>
+        <w:rPr>
+          <w:b/>
+          <w:bCs/>
+        </w:rPr>
+        <w:t>Descripción:</w:t>
+      </w:r>
+      <w:r>
+        <w:t xml:space="preserve"> Registra una nueva asignación cuando una empresa devuelve a un estudiante. </w:t>
+      </w:r>
+      <w:r>
+        <w:rPr>
+          <w:b/>
+          <w:bCs/>
+        </w:rPr>
+        <w:t>Precondiciones:</w:t>
+      </w:r>
+      <w:r>
+        <w:t xml:space="preserve"> Debe existir una asignación previa. </w:t>
+      </w:r>
+      <w:r>
+        <w:rPr>
+          <w:b/>
+          <w:bCs/>
+        </w:rPr>
+        <w:t>Flujo principal:</w:t>
+      </w:r>
+    </w:p>
+    <w:p>
+      <w:pPr>
+        <w:numPr>
+          <w:ilvl w:val="0"/>
+          <w:numId w:val="57"/>
+        </w:numPr>
+      </w:pPr>
+      <w:r>
+        <w:t>Marcar devolución.</w:t>
+      </w:r>
+    </w:p>
+    <w:p>
+      <w:pPr>
+        <w:numPr>
+          <w:ilvl w:val="0"/>
+          <w:numId w:val="57"/>
+        </w:numPr>
+      </w:pPr>
+      <w:r>
+        <w:t>Seleccionar nueva empresa y tutor.</w:t>
+      </w:r>
+    </w:p>
+    <w:p>
+      <w:pPr>
+        <w:numPr>
+          <w:ilvl w:val="0"/>
+          <w:numId w:val="57"/>
+        </w:numPr>
+      </w:pPr>
+      <w:r>
+        <w:t xml:space="preserve">Registrar nueva asignación. </w:t>
+      </w:r>
+      <w:r>
+        <w:rPr>
+          <w:b/>
+          <w:bCs/>
+        </w:rPr>
+        <w:t>Postcondiciones:</w:t>
+      </w:r>
+      <w:r>
+        <w:t xml:space="preserve"> Se crea un nuevo registro de formación.</w:t>
       </w:r>
     </w:p>
     <w:p>
@@ -7996,51 +8489,52 @@
           <w:b/>
           <w:bCs/>
         </w:rPr>
-        <w:t>CU07 – Modificar datos propios</w:t>
-      </w:r>
-    </w:p>
-    <w:p>
+        <w:t>CU12 – Registrar faltas de asisten</w:t>
+      </w:r>
       <w:r>
         <w:rPr>
           <w:b/>
           <w:bCs/>
         </w:rPr>
-        <w:t>Actor:</w:t>
-      </w:r>
-      <w:r>
-        <w:t xml:space="preserve"> </w:t>
-      </w:r>
-      <w:r>
-        <w:t>Estudiante</w:t>
-      </w:r>
-      <w:r>
-        <w:t xml:space="preserve">, Profesor tutor, Tutor de empresa, Estudiante </w:t>
-      </w:r>
+        <w:t>cia</w:t>
+      </w:r>
+    </w:p>
+    <w:p>
       <w:r>
         <w:rPr>
           <w:b/>
           <w:bCs/>
         </w:rPr>
-        <w:t>Descripción:</w:t>
-      </w:r>
-      <w:r>
-        <w:t xml:space="preserve"> Permite modificar ciertos datos personales según el rol. </w:t>
+        <w:t>Actor:</w:t>
+      </w:r>
+      <w:r>
+        <w:t xml:space="preserve"> Tutor de empresa </w:t>
       </w:r>
       <w:r>
         <w:rPr>
           <w:b/>
           <w:bCs/>
         </w:rPr>
-        <w:t>Precondiciones:</w:t>
-      </w:r>
-      <w:r>
-        <w:t xml:space="preserve"> Sesión iniciada. </w:t>
+        <w:t>Descripción:</w:t>
+      </w:r>
+      <w:r>
+        <w:t xml:space="preserve"> Registra ausencias del estudiante asignado. </w:t>
       </w:r>
       <w:r>
         <w:rPr>
           <w:b/>
           <w:bCs/>
         </w:rPr>
+        <w:t>Precondiciones:</w:t>
+      </w:r>
+      <w:r>
+        <w:t xml:space="preserve"> Debe existir una asignación activa. </w:t>
+      </w:r>
+      <w:r>
+        <w:rPr>
+          <w:b/>
+          <w:bCs/>
+        </w:rPr>
         <w:t>Flujo principal:</w:t>
       </w:r>
     </w:p>
@@ -8048,33 +8542,33 @@
       <w:pPr>
         <w:numPr>
           <w:ilvl w:val="0"/>
-          <w:numId w:val="53"/>
+          <w:numId w:val="58"/>
         </w:numPr>
       </w:pPr>
       <w:r>
-        <w:t>Acceder a “Mis datos”.</w:t>
+        <w:t>Seleccionar estudiante.</w:t>
       </w:r>
     </w:p>
     <w:p>
       <w:pPr>
         <w:numPr>
           <w:ilvl w:val="0"/>
-          <w:numId w:val="53"/>
+          <w:numId w:val="58"/>
         </w:numPr>
       </w:pPr>
       <w:r>
-        <w:t>Editar campos permitidos.</w:t>
+        <w:t>Registrar fecha y descripción.</w:t>
       </w:r>
     </w:p>
     <w:p>
       <w:pPr>
         <w:numPr>
           <w:ilvl w:val="0"/>
-          <w:numId w:val="53"/>
+          <w:numId w:val="58"/>
         </w:numPr>
       </w:pPr>
       <w:r>
-        <w:t xml:space="preserve">Guardar cambios. </w:t>
+        <w:t xml:space="preserve">Guardar. </w:t>
       </w:r>
       <w:r>
         <w:rPr>
@@ -8084,7 +8578,7 @@
         <w:t>Postcondiciones:</w:t>
       </w:r>
       <w:r>
-        <w:t xml:space="preserve"> Datos personales actualizados.</w:t>
+        <w:t xml:space="preserve"> Falta registrada.</w:t>
       </w:r>
     </w:p>
     <w:p>
@@ -8106,7 +8600,7 @@
           <w:b/>
           <w:bCs/>
         </w:rPr>
-        <w:t>CU08 – Gestionar empresas</w:t>
+        <w:t>CU13 – Consultar datos del estudiante</w:t>
       </w:r>
     </w:p>
     <w:p>
@@ -8118,7 +8612,7 @@
         <w:t>Actor:</w:t>
       </w:r>
       <w:r>
-        <w:t xml:space="preserve"> Administrador, Profesor tutor </w:t>
+        <w:t xml:space="preserve"> Tutor de empresa </w:t>
       </w:r>
       <w:r>
         <w:rPr>
@@ -8128,7 +8622,7 @@
         <w:t>Descripción:</w:t>
       </w:r>
       <w:r>
-        <w:t xml:space="preserve"> Alta, baja, modificación y consulta de empresas colaboradoras. </w:t>
+        <w:t xml:space="preserve"> Visualiza información relevante del estudiante asignado. </w:t>
       </w:r>
       <w:r>
         <w:rPr>
@@ -8138,7 +8632,7 @@
         <w:t>Precondiciones:</w:t>
       </w:r>
       <w:r>
-        <w:t xml:space="preserve"> Sesión iniciada como administrador o profesor tutor. </w:t>
+        <w:t xml:space="preserve"> El tutor debe estar asignado al estudiante. </w:t>
       </w:r>
       <w:r>
         <w:rPr>
@@ -8152,33 +8646,22 @@
       <w:pPr>
         <w:numPr>
           <w:ilvl w:val="0"/>
-          <w:numId w:val="54"/>
+          <w:numId w:val="59"/>
         </w:numPr>
       </w:pPr>
       <w:r>
-        <w:t>Seleccionar acción.</w:t>
+        <w:t>Seleccionar estudiante.</w:t>
       </w:r>
     </w:p>
     <w:p>
       <w:pPr>
         <w:numPr>
           <w:ilvl w:val="0"/>
-          <w:numId w:val="54"/>
+          <w:numId w:val="59"/>
         </w:numPr>
       </w:pPr>
       <w:r>
-        <w:t>Introducir o editar datos.</w:t>
-      </w:r>
-    </w:p>
-    <w:p>
-      <w:pPr>
-        <w:numPr>
-          <w:ilvl w:val="0"/>
-          <w:numId w:val="54"/>
-        </w:numPr>
-      </w:pPr>
-      <w:r>
-        <w:t xml:space="preserve">Confirmar operación. </w:t>
+        <w:t xml:space="preserve">Visualizar datos. </w:t>
       </w:r>
       <w:r>
         <w:rPr>
@@ -8188,7 +8671,7 @@
         <w:t>Postcondiciones:</w:t>
       </w:r>
       <w:r>
-        <w:t xml:space="preserve"> Empresa registrada o actualizada.</w:t>
+        <w:t xml:space="preserve"> Ninguna.</w:t>
       </w:r>
     </w:p>
     <w:p>
@@ -8210,7 +8693,7 @@
           <w:b/>
           <w:bCs/>
         </w:rPr>
-        <w:t>CU09 – Gestionar tutores de empresa</w:t>
+        <w:t>CU14 – Calificar al estudiante</w:t>
       </w:r>
     </w:p>
     <w:p>
@@ -8222,7 +8705,7 @@
         <w:t>Actor:</w:t>
       </w:r>
       <w:r>
-        <w:t xml:space="preserve"> Administrador, Profesor tutor </w:t>
+        <w:t xml:space="preserve"> Tutor de empresa </w:t>
       </w:r>
       <w:r>
         <w:rPr>
@@ -8232,7 +8715,7 @@
         <w:t>Descripción:</w:t>
       </w:r>
       <w:r>
-        <w:t xml:space="preserve"> Alta, baja, modificación y consulta de tutores de empresa. </w:t>
+        <w:t xml:space="preserve"> Introduce la calificación final del estudiante. </w:t>
       </w:r>
       <w:r>
         <w:rPr>
@@ -8242,7 +8725,7 @@
         <w:t>Precondiciones:</w:t>
       </w:r>
       <w:r>
-        <w:t xml:space="preserve"> Debe existir la empresa asociada. </w:t>
+        <w:t xml:space="preserve"> Estar en periodo de calificación. </w:t>
       </w:r>
       <w:r>
         <w:rPr>
@@ -8256,33 +8739,33 @@
       <w:pPr>
         <w:numPr>
           <w:ilvl w:val="0"/>
-          <w:numId w:val="55"/>
+          <w:numId w:val="60"/>
         </w:numPr>
       </w:pPr>
       <w:r>
-        <w:t>Seleccionar empresa.</w:t>
+        <w:t>Seleccionar estudiante.</w:t>
       </w:r>
     </w:p>
     <w:p>
       <w:pPr>
         <w:numPr>
           <w:ilvl w:val="0"/>
-          <w:numId w:val="55"/>
+          <w:numId w:val="60"/>
         </w:numPr>
       </w:pPr>
       <w:r>
-        <w:t>Añadir o modificar tutor.</w:t>
+        <w:t>Introducir calificación.</w:t>
       </w:r>
     </w:p>
     <w:p>
       <w:pPr>
         <w:numPr>
           <w:ilvl w:val="0"/>
-          <w:numId w:val="55"/>
+          <w:numId w:val="60"/>
         </w:numPr>
       </w:pPr>
       <w:r>
-        <w:t xml:space="preserve">Guardar cambios. </w:t>
+        <w:t xml:space="preserve">Confirmar. </w:t>
       </w:r>
       <w:r>
         <w:rPr>
@@ -8292,7 +8775,7 @@
         <w:t>Postcondiciones:</w:t>
       </w:r>
       <w:r>
-        <w:t xml:space="preserve"> Tutor de empresa registrado o actualizado.</w:t>
+        <w:t xml:space="preserve"> Calificación registrada.</w:t>
       </w:r>
     </w:p>
     <w:p>
@@ -8314,7 +8797,7 @@
           <w:b/>
           <w:bCs/>
         </w:rPr>
-        <w:t>CU10 – Asignar estudiante a tutor de empresa</w:t>
+        <w:t>CU15 – Consultar datos de empresa y tutor</w:t>
       </w:r>
     </w:p>
     <w:p>
@@ -8326,7 +8809,7 @@
         <w:t>Actor:</w:t>
       </w:r>
       <w:r>
-        <w:t xml:space="preserve"> Administrador, Profesor tutor </w:t>
+        <w:t xml:space="preserve"> Estudiante </w:t>
       </w:r>
       <w:r>
         <w:rPr>
@@ -8336,7 +8819,7 @@
         <w:t>Descripción:</w:t>
       </w:r>
       <w:r>
-        <w:t xml:space="preserve"> Asigna un estudiante a un tutor de empresa para un periodo de formación. </w:t>
+        <w:t xml:space="preserve"> El estudiante consulta la información de su empresa y tutor asignados. </w:t>
       </w:r>
       <w:r>
         <w:rPr>
@@ -8346,7 +8829,7 @@
         <w:t>Precondiciones:</w:t>
       </w:r>
       <w:r>
-        <w:t xml:space="preserve"> Deben existir estudiante, empresa y tutor de empresa. </w:t>
+        <w:t xml:space="preserve"> Debe existir asignación activa. </w:t>
       </w:r>
       <w:r>
         <w:rPr>
@@ -8360,44 +8843,22 @@
       <w:pPr>
         <w:numPr>
           <w:ilvl w:val="0"/>
-          <w:numId w:val="56"/>
+          <w:numId w:val="61"/>
         </w:numPr>
       </w:pPr>
       <w:r>
-        <w:t>Seleccionar estudiante.</w:t>
+        <w:t>Acceder a “Mi empresa”.</w:t>
       </w:r>
     </w:p>
     <w:p>
       <w:pPr>
         <w:numPr>
           <w:ilvl w:val="0"/>
-          <w:numId w:val="56"/>
+          <w:numId w:val="61"/>
         </w:numPr>
       </w:pPr>
       <w:r>
-        <w:t>Seleccionar empresa.</w:t>
-      </w:r>
-    </w:p>
-    <w:p>
-      <w:pPr>
-        <w:numPr>
-          <w:ilvl w:val="0"/>
-          <w:numId w:val="56"/>
-        </w:numPr>
-      </w:pPr>
-      <w:r>
-        <w:t>Seleccionar tutor de empresa.</w:t>
-      </w:r>
-    </w:p>
-    <w:p>
-      <w:pPr>
-        <w:numPr>
-          <w:ilvl w:val="0"/>
-          <w:numId w:val="56"/>
-        </w:numPr>
-      </w:pPr>
-      <w:r>
-        <w:t xml:space="preserve">Confirmar asignación. </w:t>
+        <w:t xml:space="preserve">Visualizar datos. </w:t>
       </w:r>
       <w:r>
         <w:rPr>
@@ -8407,7 +8868,7 @@
         <w:t>Postcondiciones:</w:t>
       </w:r>
       <w:r>
-        <w:t xml:space="preserve"> El estudiante queda vinculado a la empresa y tutor.</w:t>
+        <w:t xml:space="preserve"> Ninguna.</w:t>
       </w:r>
     </w:p>
     <w:p>
@@ -8429,45 +8890,58 @@
           <w:b/>
           <w:bCs/>
         </w:rPr>
-        <w:t>CU11 – Registrar nueva asignación por devolución</w:t>
-      </w:r>
-    </w:p>
-    <w:p>
+        <w:t xml:space="preserve">CU16 – </w:t>
+      </w:r>
       <w:r>
         <w:rPr>
           <w:b/>
           <w:bCs/>
         </w:rPr>
-        <w:t>Actor:</w:t>
-      </w:r>
-      <w:r>
-        <w:t xml:space="preserve"> Administrador, Profesor tutor </w:t>
-      </w:r>
+        <w:t>Justificar Faltas</w:t>
+      </w:r>
+    </w:p>
+    <w:p>
       <w:r>
         <w:rPr>
           <w:b/>
           <w:bCs/>
         </w:rPr>
-        <w:t>Descripción:</w:t>
-      </w:r>
-      <w:r>
-        <w:t xml:space="preserve"> Registra una nueva asignación cuando una empresa devuelve a un estudiante. </w:t>
+        <w:t>Actor:</w:t>
+      </w:r>
+      <w:r>
+        <w:t xml:space="preserve"> Estudiante </w:t>
       </w:r>
       <w:r>
         <w:rPr>
           <w:b/>
           <w:bCs/>
         </w:rPr>
-        <w:t>Precondiciones:</w:t>
-      </w:r>
-      <w:r>
-        <w:t xml:space="preserve"> Debe existir una asignación previa. </w:t>
+        <w:t>Descripción:</w:t>
+      </w:r>
+      <w:r>
+        <w:t xml:space="preserve"> El estudiante sube documentos justificativos de ausencias</w:t>
+      </w:r>
+      <w:r>
+        <w:t xml:space="preserve"> para justificar una falta asignada a su formación en Empresa</w:t>
+      </w:r>
+      <w:r>
+        <w:t xml:space="preserve">. </w:t>
       </w:r>
       <w:r>
         <w:rPr>
           <w:b/>
           <w:bCs/>
         </w:rPr>
+        <w:t>Precondiciones:</w:t>
+      </w:r>
+      <w:r>
+        <w:t xml:space="preserve"> Debe existir una falta registrada. </w:t>
+      </w:r>
+      <w:r>
+        <w:rPr>
+          <w:b/>
+          <w:bCs/>
+        </w:rPr>
         <w:t>Flujo principal:</w:t>
       </w:r>
     </w:p>
@@ -8475,33 +8949,33 @@
       <w:pPr>
         <w:numPr>
           <w:ilvl w:val="0"/>
-          <w:numId w:val="57"/>
+          <w:numId w:val="62"/>
         </w:numPr>
       </w:pPr>
       <w:r>
-        <w:t>Marcar devolución.</w:t>
+        <w:t>Seleccionar falta.</w:t>
       </w:r>
     </w:p>
     <w:p>
       <w:pPr>
         <w:numPr>
           <w:ilvl w:val="0"/>
-          <w:numId w:val="57"/>
+          <w:numId w:val="62"/>
         </w:numPr>
       </w:pPr>
       <w:r>
-        <w:t>Seleccionar nueva empresa y tutor.</w:t>
+        <w:t>Adjuntar archivo.</w:t>
       </w:r>
     </w:p>
     <w:p>
       <w:pPr>
         <w:numPr>
           <w:ilvl w:val="0"/>
-          <w:numId w:val="57"/>
+          <w:numId w:val="62"/>
         </w:numPr>
       </w:pPr>
       <w:r>
-        <w:t xml:space="preserve">Registrar nueva asignación. </w:t>
+        <w:t xml:space="preserve">Confirmar. </w:t>
       </w:r>
       <w:r>
         <w:rPr>
@@ -8511,7 +8985,7 @@
         <w:t>Postcondiciones:</w:t>
       </w:r>
       <w:r>
-        <w:t xml:space="preserve"> Se crea un nuevo registro de formación.</w:t>
+        <w:t xml:space="preserve"> Justificante almacenado.</w:t>
       </w:r>
     </w:p>
     <w:p>
@@ -8533,544 +9007,53 @@
           <w:b/>
           <w:bCs/>
         </w:rPr>
-        <w:t>CU12 – Registrar faltas de asisten</w:t>
-      </w:r>
+        <w:t>CU17 – Registrar incidencias</w:t>
+      </w:r>
+    </w:p>
+    <w:p>
       <w:r>
         <w:rPr>
           <w:b/>
           <w:bCs/>
         </w:rPr>
-        <w:t>cia</w:t>
-      </w:r>
-    </w:p>
-    <w:p>
+        <w:t>Actor:</w:t>
+      </w:r>
+      <w:r>
+        <w:t xml:space="preserve"> Tutor de empresa </w:t>
+      </w:r>
       <w:r>
         <w:rPr>
           <w:b/>
           <w:bCs/>
         </w:rPr>
-        <w:t>Actor:</w:t>
-      </w:r>
-      <w:r>
-        <w:t xml:space="preserve"> Tutor de empresa </w:t>
+        <w:t>Descripción:</w:t>
+      </w:r>
+      <w:r>
+        <w:t xml:space="preserve"> El tutor de empresa registra incidencias relacionadas con el estudiante. </w:t>
       </w:r>
       <w:r>
         <w:rPr>
           <w:b/>
           <w:bCs/>
         </w:rPr>
-        <w:t>Descripción:</w:t>
-      </w:r>
-      <w:r>
-        <w:t xml:space="preserve"> Registra ausencias del estudiante asignado. </w:t>
-      </w:r>
-      <w:r>
-        <w:rPr>
-          <w:b/>
-          <w:bCs/>
-        </w:rPr>
         <w:t>Precondiciones:</w:t>
       </w:r>
       <w:r>
-        <w:t xml:space="preserve"> Debe existir una asignación activa. </w:t>
-      </w:r>
-      <w:r>
-        <w:rPr>
-          <w:b/>
-          <w:bCs/>
-        </w:rPr>
-        <w:t>Flujo principal:</w:t>
-      </w:r>
-    </w:p>
-    <w:p>
-      <w:pPr>
-        <w:numPr>
-          <w:ilvl w:val="0"/>
-          <w:numId w:val="58"/>
-        </w:numPr>
-      </w:pPr>
-      <w:r>
-        <w:t>Seleccionar estudiante.</w:t>
-      </w:r>
-    </w:p>
-    <w:p>
-      <w:pPr>
-        <w:numPr>
-          <w:ilvl w:val="0"/>
-          <w:numId w:val="58"/>
-        </w:numPr>
-      </w:pPr>
-      <w:r>
-        <w:t>Registrar fecha y descripción.</w:t>
-      </w:r>
-    </w:p>
-    <w:p>
-      <w:pPr>
-        <w:numPr>
-          <w:ilvl w:val="0"/>
-          <w:numId w:val="58"/>
-        </w:numPr>
-      </w:pPr>
-      <w:r>
-        <w:t xml:space="preserve">Guardar. </w:t>
-      </w:r>
-      <w:r>
-        <w:rPr>
-          <w:b/>
-          <w:bCs/>
-        </w:rPr>
-        <w:t>Postcondiciones:</w:t>
-      </w:r>
-      <w:r>
-        <w:t xml:space="preserve"> Falta registrada.</w:t>
-      </w:r>
-    </w:p>
-    <w:p>
-      <w:pPr>
-        <w:numPr>
-          <w:ilvl w:val="0"/>
-          <w:numId w:val="22"/>
-        </w:numPr>
-        <w:tabs>
-          <w:tab w:val="num" w:pos="360"/>
-        </w:tabs>
-        <w:rPr>
-          <w:b/>
-          <w:bCs/>
-        </w:rPr>
-      </w:pPr>
-      <w:r>
-        <w:rPr>
-          <w:b/>
-          <w:bCs/>
-        </w:rPr>
-        <w:t>CU13 – Consultar datos del estudiante</w:t>
-      </w:r>
-    </w:p>
-    <w:p>
-      <w:r>
-        <w:rPr>
-          <w:b/>
-          <w:bCs/>
-        </w:rPr>
-        <w:t>Actor:</w:t>
-      </w:r>
-      <w:r>
-        <w:t xml:space="preserve"> Tutor de empresa </w:t>
-      </w:r>
-      <w:r>
-        <w:rPr>
-          <w:b/>
-          <w:bCs/>
-        </w:rPr>
-        <w:t>Descripción:</w:t>
-      </w:r>
-      <w:r>
-        <w:t xml:space="preserve"> Visualiza información relevante del estudiante asignado. </w:t>
-      </w:r>
-      <w:r>
-        <w:rPr>
-          <w:b/>
-          <w:bCs/>
-        </w:rPr>
-        <w:t>Precondiciones:</w:t>
-      </w:r>
-      <w:r>
-        <w:t xml:space="preserve"> El tutor debe estar asignado al estudiante. </w:t>
-      </w:r>
-      <w:r>
-        <w:rPr>
-          <w:b/>
-          <w:bCs/>
-        </w:rPr>
-        <w:t>Flujo principal:</w:t>
-      </w:r>
-    </w:p>
-    <w:p>
-      <w:pPr>
-        <w:numPr>
-          <w:ilvl w:val="0"/>
-          <w:numId w:val="59"/>
-        </w:numPr>
-      </w:pPr>
-      <w:r>
-        <w:t>Seleccionar estudiante.</w:t>
-      </w:r>
-    </w:p>
-    <w:p>
-      <w:pPr>
-        <w:numPr>
-          <w:ilvl w:val="0"/>
-          <w:numId w:val="59"/>
-        </w:numPr>
-      </w:pPr>
-      <w:r>
-        <w:t xml:space="preserve">Visualizar datos. </w:t>
-      </w:r>
-      <w:r>
-        <w:rPr>
-          <w:b/>
-          <w:bCs/>
-        </w:rPr>
-        <w:t>Postcondiciones:</w:t>
-      </w:r>
-      <w:r>
-        <w:t xml:space="preserve"> Ninguna.</w:t>
-      </w:r>
-    </w:p>
-    <w:p>
-      <w:pPr>
-        <w:numPr>
-          <w:ilvl w:val="0"/>
-          <w:numId w:val="22"/>
-        </w:numPr>
-        <w:tabs>
-          <w:tab w:val="num" w:pos="360"/>
-        </w:tabs>
-        <w:rPr>
-          <w:b/>
-          <w:bCs/>
-        </w:rPr>
-      </w:pPr>
-      <w:r>
-        <w:rPr>
-          <w:b/>
-          <w:bCs/>
-        </w:rPr>
-        <w:t>CU14 – Calificar al estudiante</w:t>
-      </w:r>
-    </w:p>
-    <w:p>
-      <w:r>
-        <w:rPr>
-          <w:b/>
-          <w:bCs/>
-        </w:rPr>
-        <w:t>Actor:</w:t>
-      </w:r>
-      <w:r>
-        <w:t xml:space="preserve"> Tutor de empresa </w:t>
-      </w:r>
-      <w:r>
-        <w:rPr>
-          <w:b/>
-          <w:bCs/>
-        </w:rPr>
-        <w:t>Descripción:</w:t>
-      </w:r>
-      <w:r>
-        <w:t xml:space="preserve"> Introduce la calificación final del estudiante. </w:t>
-      </w:r>
-      <w:r>
-        <w:rPr>
-          <w:b/>
-          <w:bCs/>
-        </w:rPr>
-        <w:t>Precondiciones:</w:t>
-      </w:r>
-      <w:r>
-        <w:t xml:space="preserve"> Estar en periodo de calificación. </w:t>
-      </w:r>
-      <w:r>
-        <w:rPr>
-          <w:b/>
-          <w:bCs/>
-        </w:rPr>
-        <w:t>Flujo principal:</w:t>
-      </w:r>
-    </w:p>
-    <w:p>
-      <w:pPr>
-        <w:numPr>
-          <w:ilvl w:val="0"/>
-          <w:numId w:val="60"/>
-        </w:numPr>
-      </w:pPr>
-      <w:r>
-        <w:t>Seleccionar estudiante.</w:t>
-      </w:r>
-    </w:p>
-    <w:p>
-      <w:pPr>
-        <w:numPr>
-          <w:ilvl w:val="0"/>
-          <w:numId w:val="60"/>
-        </w:numPr>
-      </w:pPr>
-      <w:r>
-        <w:t>Introducir calificación.</w:t>
-      </w:r>
-    </w:p>
-    <w:p>
-      <w:pPr>
-        <w:numPr>
-          <w:ilvl w:val="0"/>
-          <w:numId w:val="60"/>
-        </w:numPr>
-      </w:pPr>
-      <w:r>
-        <w:t xml:space="preserve">Confirmar. </w:t>
-      </w:r>
-      <w:r>
-        <w:rPr>
-          <w:b/>
-          <w:bCs/>
-        </w:rPr>
-        <w:t>Postcondiciones:</w:t>
-      </w:r>
-      <w:r>
-        <w:t xml:space="preserve"> Calificación registrada.</w:t>
-      </w:r>
-    </w:p>
-    <w:p>
-      <w:pPr>
-        <w:numPr>
-          <w:ilvl w:val="0"/>
-          <w:numId w:val="22"/>
-        </w:numPr>
-        <w:tabs>
-          <w:tab w:val="num" w:pos="360"/>
-        </w:tabs>
-        <w:rPr>
-          <w:b/>
-          <w:bCs/>
-        </w:rPr>
-      </w:pPr>
-      <w:r>
-        <w:rPr>
-          <w:b/>
-          <w:bCs/>
-        </w:rPr>
-        <w:t>CU15 – Consultar datos de empresa y tutor</w:t>
-      </w:r>
-    </w:p>
-    <w:p>
-      <w:r>
-        <w:rPr>
-          <w:b/>
-          <w:bCs/>
-        </w:rPr>
-        <w:t>Actor:</w:t>
-      </w:r>
-      <w:r>
-        <w:t xml:space="preserve"> Estudiante </w:t>
-      </w:r>
-      <w:r>
-        <w:rPr>
-          <w:b/>
-          <w:bCs/>
-        </w:rPr>
-        <w:t>Descripción:</w:t>
-      </w:r>
-      <w:r>
-        <w:t xml:space="preserve"> El estudiante consulta la información de su empresa y tutor asignados. </w:t>
-      </w:r>
-      <w:r>
-        <w:rPr>
-          <w:b/>
-          <w:bCs/>
-        </w:rPr>
-        <w:t>Precondiciones:</w:t>
-      </w:r>
-      <w:r>
-        <w:t xml:space="preserve"> Debe existir asignación activa. </w:t>
-      </w:r>
-      <w:r>
-        <w:rPr>
-          <w:b/>
-          <w:bCs/>
-        </w:rPr>
-        <w:t>Flujo principal:</w:t>
-      </w:r>
-    </w:p>
-    <w:p>
-      <w:pPr>
-        <w:numPr>
-          <w:ilvl w:val="0"/>
-          <w:numId w:val="61"/>
-        </w:numPr>
-      </w:pPr>
-      <w:r>
-        <w:t>Acceder a “Mi empresa”.</w:t>
-      </w:r>
-    </w:p>
-    <w:p>
-      <w:pPr>
-        <w:numPr>
-          <w:ilvl w:val="0"/>
-          <w:numId w:val="61"/>
-        </w:numPr>
-      </w:pPr>
-      <w:r>
-        <w:t xml:space="preserve">Visualizar datos. </w:t>
-      </w:r>
-      <w:r>
-        <w:rPr>
-          <w:b/>
-          <w:bCs/>
-        </w:rPr>
-        <w:t>Postcondiciones:</w:t>
-      </w:r>
-      <w:r>
-        <w:t xml:space="preserve"> Ninguna.</w:t>
-      </w:r>
-    </w:p>
-    <w:p>
-      <w:pPr>
-        <w:numPr>
-          <w:ilvl w:val="0"/>
-          <w:numId w:val="22"/>
-        </w:numPr>
-        <w:tabs>
-          <w:tab w:val="num" w:pos="360"/>
-        </w:tabs>
-        <w:rPr>
-          <w:b/>
-          <w:bCs/>
-        </w:rPr>
-      </w:pPr>
-      <w:r>
-        <w:rPr>
-          <w:b/>
-          <w:bCs/>
-        </w:rPr>
-        <w:t>CU16 – Adjuntar justificantes de faltas</w:t>
-      </w:r>
-    </w:p>
-    <w:p>
-      <w:r>
-        <w:rPr>
-          <w:b/>
-          <w:bCs/>
-        </w:rPr>
-        <w:t>Actor:</w:t>
-      </w:r>
-      <w:r>
-        <w:t xml:space="preserve"> Estudiante </w:t>
-      </w:r>
-      <w:r>
-        <w:rPr>
-          <w:b/>
-          <w:bCs/>
-        </w:rPr>
-        <w:t>Descripción:</w:t>
-      </w:r>
-      <w:r>
-        <w:t xml:space="preserve"> El estudiante sube documentos justificativos de ausencias. </w:t>
-      </w:r>
-      <w:r>
-        <w:rPr>
-          <w:b/>
-          <w:bCs/>
-        </w:rPr>
-        <w:t>Precondiciones:</w:t>
-      </w:r>
-      <w:r>
-        <w:t xml:space="preserve"> Debe existir una falta registrada. </w:t>
-      </w:r>
-      <w:r>
-        <w:rPr>
-          <w:b/>
-          <w:bCs/>
-        </w:rPr>
-        <w:t>Flujo principal:</w:t>
-      </w:r>
-    </w:p>
-    <w:p>
-      <w:pPr>
-        <w:numPr>
-          <w:ilvl w:val="0"/>
-          <w:numId w:val="62"/>
-        </w:numPr>
-      </w:pPr>
-      <w:r>
-        <w:t>Seleccionar falta.</w:t>
-      </w:r>
-    </w:p>
-    <w:p>
-      <w:pPr>
-        <w:numPr>
-          <w:ilvl w:val="0"/>
-          <w:numId w:val="62"/>
-        </w:numPr>
-      </w:pPr>
-      <w:r>
-        <w:t>Adjuntar archivo.</w:t>
-      </w:r>
-    </w:p>
-    <w:p>
-      <w:pPr>
-        <w:numPr>
-          <w:ilvl w:val="0"/>
-          <w:numId w:val="62"/>
-        </w:numPr>
-      </w:pPr>
-      <w:r>
-        <w:t xml:space="preserve">Confirmar. </w:t>
-      </w:r>
-      <w:r>
-        <w:rPr>
-          <w:b/>
-          <w:bCs/>
-        </w:rPr>
-        <w:t>Postcondiciones:</w:t>
-      </w:r>
-      <w:r>
-        <w:t xml:space="preserve"> Justificante almacenado.</w:t>
-      </w:r>
-    </w:p>
-    <w:p>
-      <w:pPr>
-        <w:numPr>
-          <w:ilvl w:val="0"/>
-          <w:numId w:val="22"/>
-        </w:numPr>
-        <w:tabs>
-          <w:tab w:val="num" w:pos="360"/>
-        </w:tabs>
-        <w:rPr>
-          <w:b/>
-          <w:bCs/>
-        </w:rPr>
-      </w:pPr>
-      <w:r>
-        <w:rPr>
-          <w:b/>
-          <w:bCs/>
-        </w:rPr>
-        <w:t>CU17 – Registrar incidencias</w:t>
-      </w:r>
-    </w:p>
-    <w:p>
-      <w:r>
-        <w:rPr>
-          <w:b/>
-          <w:bCs/>
-        </w:rPr>
-        <w:t>Actor:</w:t>
-      </w:r>
-      <w:r>
-        <w:t xml:space="preserve"> Tutor de empresa </w:t>
-      </w:r>
-      <w:r>
-        <w:rPr>
-          <w:b/>
-          <w:bCs/>
-        </w:rPr>
-        <w:t>Descripción:</w:t>
-      </w:r>
-      <w:r>
-        <w:t xml:space="preserve"> El tutor de empresa registra incidencias relacionadas con el estudiante. </w:t>
-      </w:r>
-      <w:r>
-        <w:rPr>
-          <w:b/>
-          <w:bCs/>
-        </w:rPr>
-        <w:t>Precondiciones:</w:t>
-      </w:r>
-      <w:r>
-        <w:t xml:space="preserve"> Debe existir asignación activa. </w:t>
+        <w:t xml:space="preserve"> Debe existir </w:t>
+      </w:r>
+      <w:r>
+        <w:t xml:space="preserve">un Profesor y un Estudiantes asociados en la </w:t>
+      </w:r>
+      <w:proofErr w:type="gramStart"/>
+      <w:r>
+        <w:t xml:space="preserve">formación </w:t>
+      </w:r>
+      <w:r>
+        <w:t>.</w:t>
+      </w:r>
+      <w:proofErr w:type="gramEnd"/>
+      <w:r>
+        <w:t xml:space="preserve"> </w:t>
       </w:r>
       <w:r>
         <w:rPr>
@@ -9135,25 +9118,39 @@
           <w:b/>
           <w:bCs/>
         </w:rPr>
-        <w:t>CU18 – Subir informes de seguimiento</w:t>
-      </w:r>
-    </w:p>
-    <w:p>
+        <w:t xml:space="preserve">CU18 – </w:t>
+      </w:r>
       <w:r>
         <w:rPr>
           <w:b/>
           <w:bCs/>
         </w:rPr>
-        <w:t>Actor:</w:t>
-      </w:r>
-      <w:r>
-        <w:t xml:space="preserve"> Profesor tutor </w:t>
+        <w:t>Generar</w:t>
       </w:r>
       <w:r>
         <w:rPr>
           <w:b/>
           <w:bCs/>
         </w:rPr>
+        <w:t xml:space="preserve"> informes de seguimiento</w:t>
+      </w:r>
+    </w:p>
+    <w:p>
+      <w:r>
+        <w:rPr>
+          <w:b/>
+          <w:bCs/>
+        </w:rPr>
+        <w:t>Actor:</w:t>
+      </w:r>
+      <w:r>
+        <w:t xml:space="preserve"> Profesor tutor </w:t>
+      </w:r>
+      <w:r>
+        <w:rPr>
+          <w:b/>
+          <w:bCs/>
+        </w:rPr>
         <w:t>Descripción:</w:t>
       </w:r>
       <w:r>
@@ -9163,14 +9160,14 @@
         <w:t>Coordinador</w:t>
       </w:r>
       <w:r>
-        <w:t xml:space="preserve"> sube los informes de seguimiento del </w:t>
+        <w:t xml:space="preserve"> </w:t>
+      </w:r>
+      <w:r>
+        <w:t xml:space="preserve">crea un informe de seguimiento con los detalles de la </w:t>
       </w:r>
       <w:proofErr w:type="gramStart"/>
       <w:r>
-        <w:t>estudiante</w:t>
-      </w:r>
-      <w:r>
-        <w:t xml:space="preserve"> </w:t>
+        <w:t xml:space="preserve">formación  </w:t>
       </w:r>
       <w:r>
         <w:t>.</w:t>
@@ -9240,113 +9237,6 @@
         <w:t xml:space="preserve"> Informe almacenado.</w:t>
       </w:r>
     </w:p>
-    <w:p>
-      <w:pPr>
-        <w:rPr>
-          <w:b/>
-          <w:bCs/>
-        </w:rPr>
-      </w:pPr>
-      <w:r>
-        <w:rPr>
-          <w:b/>
-          <w:bCs/>
-        </w:rPr>
-        <w:t>CU19 – Asignar Tutor de Empresa a Estudiante</w:t>
-      </w:r>
-    </w:p>
-    <w:p>
-      <w:r>
-        <w:rPr>
-          <w:b/>
-          <w:bCs/>
-        </w:rPr>
-        <w:t>Actor principal:</w:t>
-      </w:r>
-      <w:r>
-        <w:t xml:space="preserve"> Profesor Coordinador </w:t>
-      </w:r>
-      <w:r>
-        <w:rPr>
-          <w:b/>
-          <w:bCs/>
-        </w:rPr>
-        <w:t>Descripción:</w:t>
-      </w:r>
-      <w:r>
-        <w:t xml:space="preserve"> El Profesor Coordinador asigna un tutor de empresa a un estudiante que realiza formación en dicha empresa.</w:t>
-      </w:r>
-    </w:p>
-    <w:p>
-      <w:r>
-        <w:rPr>
-          <w:b/>
-          <w:bCs/>
-        </w:rPr>
-        <w:t>Precondiciones:</w:t>
-      </w:r>
-    </w:p>
-    <w:p>
-      <w:pPr>
-        <w:numPr>
-          <w:ilvl w:val="0"/>
-          <w:numId w:val="79"/>
-        </w:numPr>
-      </w:pPr>
-      <w:r>
-        <w:t xml:space="preserve">El profesor ha iniciado sesión como </w:t>
-      </w:r>
-      <w:r>
-        <w:rPr>
-          <w:b/>
-          <w:bCs/>
-        </w:rPr>
-        <w:t>Profesor Coordinador</w:t>
-      </w:r>
-      <w:r>
-        <w:t>.</w:t>
-      </w:r>
-    </w:p>
-    <w:p>
-      <w:pPr>
-        <w:numPr>
-          <w:ilvl w:val="0"/>
-          <w:numId w:val="79"/>
-        </w:numPr>
-      </w:pPr>
-      <w:r>
-        <w:t>El estudiante y la empresa están registrados en el sistema.</w:t>
-      </w:r>
-    </w:p>
-    <w:p>
-      <w:pPr>
-        <w:numPr>
-          <w:ilvl w:val="0"/>
-          <w:numId w:val="79"/>
-        </w:numPr>
-      </w:pPr>
-      <w:r>
-        <w:t xml:space="preserve">La formación del estudiante está </w:t>
-      </w:r>
-      <w:proofErr w:type="gramStart"/>
-      <w:r>
-        <w:t>creada</w:t>
-      </w:r>
-      <w:proofErr w:type="gramEnd"/>
-      <w:r>
-        <w:t xml:space="preserve"> pero </w:t>
-      </w:r>
-      <w:r>
-        <w:rPr>
-          <w:b/>
-          <w:bCs/>
-        </w:rPr>
-        <w:t>sin tutor asignado</w:t>
-      </w:r>
-      <w:r>
-        <w:t>.</w:t>
-      </w:r>
-    </w:p>
     <w:p/>
     <w:p>
       <w:pPr>
@@ -9403,7 +9293,15 @@
       </w:r>
       <w:proofErr w:type="spellEnd"/>
       <w:r>
-        <w:t xml:space="preserve"> (PK)</w:t>
+        <w:t xml:space="preserve"> (</w:t>
+      </w:r>
+      <w:proofErr w:type="spellStart"/>
+      <w:r>
+        <w:t>PK</w:t>
+      </w:r>
+      <w:proofErr w:type="spellEnd"/>
+      <w:r>
+        <w:t>)</w:t>
       </w:r>
     </w:p>
     <w:p>
@@ -9503,7 +9401,15 @@
       </w:r>
       <w:proofErr w:type="spellEnd"/>
       <w:r>
-        <w:t xml:space="preserve"> (PK)</w:t>
+        <w:t xml:space="preserve"> (</w:t>
+      </w:r>
+      <w:proofErr w:type="spellStart"/>
+      <w:r>
+        <w:t>PK</w:t>
+      </w:r>
+      <w:proofErr w:type="spellEnd"/>
+      <w:r>
+        <w:t>)</w:t>
       </w:r>
     </w:p>
     <w:p>
@@ -9519,7 +9425,15 @@
       </w:r>
       <w:proofErr w:type="spellEnd"/>
       <w:r>
-        <w:t xml:space="preserve"> (FK)</w:t>
+        <w:t xml:space="preserve"> (</w:t>
+      </w:r>
+      <w:proofErr w:type="spellStart"/>
+      <w:r>
+        <w:t>FK</w:t>
+      </w:r>
+      <w:proofErr w:type="spellEnd"/>
+      <w:r>
+        <w:t>)</w:t>
       </w:r>
     </w:p>
     <w:p>
@@ -9535,7 +9449,15 @@
       </w:r>
       <w:proofErr w:type="spellEnd"/>
       <w:r>
-        <w:t xml:space="preserve"> (FK) — Grupo al que pertenece el estudiante</w:t>
+        <w:t xml:space="preserve"> (</w:t>
+      </w:r>
+      <w:proofErr w:type="spellStart"/>
+      <w:r>
+        <w:t>FK</w:t>
+      </w:r>
+      <w:proofErr w:type="spellEnd"/>
+      <w:r>
+        <w:t>) — Grupo al que pertenece el estudiante</w:t>
       </w:r>
     </w:p>
     <w:p>
@@ -9664,7 +9586,15 @@
       </w:r>
       <w:proofErr w:type="spellEnd"/>
       <w:r>
-        <w:t xml:space="preserve"> (PK)</w:t>
+        <w:t xml:space="preserve"> (</w:t>
+      </w:r>
+      <w:proofErr w:type="spellStart"/>
+      <w:r>
+        <w:t>PK</w:t>
+      </w:r>
+      <w:proofErr w:type="spellEnd"/>
+      <w:r>
+        <w:t>)</w:t>
       </w:r>
     </w:p>
     <w:p>
@@ -9680,7 +9610,15 @@
       </w:r>
       <w:proofErr w:type="spellEnd"/>
       <w:r>
-        <w:t xml:space="preserve"> (FK)</w:t>
+        <w:t xml:space="preserve"> (</w:t>
+      </w:r>
+      <w:proofErr w:type="spellStart"/>
+      <w:r>
+        <w:t>FK</w:t>
+      </w:r>
+      <w:proofErr w:type="spellEnd"/>
+      <w:r>
+        <w:t>)</w:t>
       </w:r>
     </w:p>
     <w:p>
@@ -9780,7 +9718,15 @@
       </w:r>
       <w:proofErr w:type="spellEnd"/>
       <w:r>
-        <w:t xml:space="preserve"> (BOOLEAN) — Indica si coordina algún curso o ciclo</w:t>
+        <w:t xml:space="preserve"> (</w:t>
+      </w:r>
+      <w:proofErr w:type="spellStart"/>
+      <w:r>
+        <w:t>BOOLEAN</w:t>
+      </w:r>
+      <w:proofErr w:type="spellEnd"/>
+      <w:r>
+        <w:t>) — Indica si coordina algún curso o ciclo</w:t>
       </w:r>
     </w:p>
     <w:p>
@@ -9852,7 +9798,15 @@
       </w:r>
       <w:proofErr w:type="spellEnd"/>
       <w:r>
-        <w:t xml:space="preserve"> (PK)</w:t>
+        <w:t xml:space="preserve"> (</w:t>
+      </w:r>
+      <w:proofErr w:type="spellStart"/>
+      <w:r>
+        <w:t>PK</w:t>
+      </w:r>
+      <w:proofErr w:type="spellEnd"/>
+      <w:r>
+        <w:t>)</w:t>
       </w:r>
     </w:p>
     <w:p>
@@ -9868,7 +9822,15 @@
       </w:r>
       <w:proofErr w:type="spellEnd"/>
       <w:r>
-        <w:t xml:space="preserve"> (FK)</w:t>
+        <w:t xml:space="preserve"> (</w:t>
+      </w:r>
+      <w:proofErr w:type="spellStart"/>
+      <w:r>
+        <w:t>FK</w:t>
+      </w:r>
+      <w:proofErr w:type="spellEnd"/>
+      <w:r>
+        <w:t>)</w:t>
       </w:r>
     </w:p>
     <w:p>
@@ -9884,7 +9846,15 @@
       </w:r>
       <w:proofErr w:type="spellEnd"/>
       <w:r>
-        <w:t xml:space="preserve"> (FK)</w:t>
+        <w:t xml:space="preserve"> (</w:t>
+      </w:r>
+      <w:proofErr w:type="spellStart"/>
+      <w:r>
+        <w:t>FK</w:t>
+      </w:r>
+      <w:proofErr w:type="spellEnd"/>
+      <w:r>
+        <w:t>)</w:t>
       </w:r>
     </w:p>
     <w:p>
@@ -9959,7 +9929,15 @@
       </w:r>
       <w:proofErr w:type="spellEnd"/>
       <w:r>
-        <w:t xml:space="preserve"> (PK)</w:t>
+        <w:t xml:space="preserve"> (</w:t>
+      </w:r>
+      <w:proofErr w:type="spellStart"/>
+      <w:r>
+        <w:t>PK</w:t>
+      </w:r>
+      <w:proofErr w:type="spellEnd"/>
+      <w:r>
+        <w:t>)</w:t>
       </w:r>
     </w:p>
     <w:p>
@@ -10026,7 +10004,15 @@
       </w:r>
       <w:proofErr w:type="spellEnd"/>
       <w:r>
-        <w:t xml:space="preserve"> (PK)</w:t>
+        <w:t xml:space="preserve"> (</w:t>
+      </w:r>
+      <w:proofErr w:type="spellStart"/>
+      <w:r>
+        <w:t>PK</w:t>
+      </w:r>
+      <w:proofErr w:type="spellEnd"/>
+      <w:r>
+        <w:t>)</w:t>
       </w:r>
     </w:p>
     <w:p>
@@ -10042,7 +10028,15 @@
       </w:r>
       <w:proofErr w:type="spellEnd"/>
       <w:r>
-        <w:t xml:space="preserve"> (FK)</w:t>
+        <w:t xml:space="preserve"> (</w:t>
+      </w:r>
+      <w:proofErr w:type="spellStart"/>
+      <w:r>
+        <w:t>FK</w:t>
+      </w:r>
+      <w:proofErr w:type="spellEnd"/>
+      <w:r>
+        <w:t>)</w:t>
       </w:r>
     </w:p>
     <w:p>
@@ -10117,7 +10111,15 @@
       </w:r>
       <w:proofErr w:type="spellEnd"/>
       <w:r>
-        <w:t xml:space="preserve"> (PK)</w:t>
+        <w:t xml:space="preserve"> (</w:t>
+      </w:r>
+      <w:proofErr w:type="spellStart"/>
+      <w:r>
+        <w:t>PK</w:t>
+      </w:r>
+      <w:proofErr w:type="spellEnd"/>
+      <w:r>
+        <w:t>)</w:t>
       </w:r>
     </w:p>
     <w:p>
@@ -10133,7 +10135,15 @@
       </w:r>
       <w:proofErr w:type="spellEnd"/>
       <w:r>
-        <w:t xml:space="preserve"> (FK)</w:t>
+        <w:t xml:space="preserve"> (</w:t>
+      </w:r>
+      <w:proofErr w:type="spellStart"/>
+      <w:r>
+        <w:t>FK</w:t>
+      </w:r>
+      <w:proofErr w:type="spellEnd"/>
+      <w:r>
+        <w:t>)</w:t>
       </w:r>
     </w:p>
     <w:p>
@@ -10184,7 +10194,15 @@
       </w:r>
       <w:proofErr w:type="spellEnd"/>
       <w:r>
-        <w:t xml:space="preserve"> (PK)</w:t>
+        <w:t xml:space="preserve"> (</w:t>
+      </w:r>
+      <w:proofErr w:type="spellStart"/>
+      <w:r>
+        <w:t>PK</w:t>
+      </w:r>
+      <w:proofErr w:type="spellEnd"/>
+      <w:r>
+        <w:t>)</w:t>
       </w:r>
     </w:p>
     <w:p>
@@ -10259,7 +10277,15 @@
       </w:r>
       <w:proofErr w:type="spellEnd"/>
       <w:r>
-        <w:t xml:space="preserve"> (PK)</w:t>
+        <w:t xml:space="preserve"> (</w:t>
+      </w:r>
+      <w:proofErr w:type="spellStart"/>
+      <w:r>
+        <w:t>PK</w:t>
+      </w:r>
+      <w:proofErr w:type="spellEnd"/>
+      <w:r>
+        <w:t>)</w:t>
       </w:r>
     </w:p>
     <w:p>
@@ -10275,7 +10301,15 @@
       </w:r>
       <w:proofErr w:type="spellEnd"/>
       <w:r>
-        <w:t xml:space="preserve"> (FK)</w:t>
+        <w:t xml:space="preserve"> (</w:t>
+      </w:r>
+      <w:proofErr w:type="spellStart"/>
+      <w:r>
+        <w:t>FK</w:t>
+      </w:r>
+      <w:proofErr w:type="spellEnd"/>
+      <w:r>
+        <w:t>)</w:t>
       </w:r>
     </w:p>
     <w:p>
@@ -10291,7 +10325,15 @@
       </w:r>
       <w:proofErr w:type="spellEnd"/>
       <w:r>
-        <w:t xml:space="preserve"> (FK)</w:t>
+        <w:t xml:space="preserve"> (</w:t>
+      </w:r>
+      <w:proofErr w:type="spellStart"/>
+      <w:r>
+        <w:t>FK</w:t>
+      </w:r>
+      <w:proofErr w:type="spellEnd"/>
+      <w:r>
+        <w:t>)</w:t>
       </w:r>
     </w:p>
     <w:p>
@@ -10307,7 +10349,15 @@
       </w:r>
       <w:proofErr w:type="spellEnd"/>
       <w:r>
-        <w:t xml:space="preserve"> (FK) — Tutor de empresa asignado</w:t>
+        <w:t xml:space="preserve"> (</w:t>
+      </w:r>
+      <w:proofErr w:type="spellStart"/>
+      <w:r>
+        <w:t>FK</w:t>
+      </w:r>
+      <w:proofErr w:type="spellEnd"/>
+      <w:r>
+        <w:t>) — Tutor de empresa asignado</w:t>
       </w:r>
     </w:p>
     <w:p>
@@ -10323,7 +10373,15 @@
       </w:r>
       <w:proofErr w:type="spellEnd"/>
       <w:r>
-        <w:t xml:space="preserve"> (FK) — Profesor que coordina la formación</w:t>
+        <w:t xml:space="preserve"> (</w:t>
+      </w:r>
+      <w:proofErr w:type="spellStart"/>
+      <w:r>
+        <w:t>FK</w:t>
+      </w:r>
+      <w:proofErr w:type="spellEnd"/>
+      <w:r>
+        <w:t>) — Profesor que coordina la formación</w:t>
       </w:r>
     </w:p>
     <w:p>
@@ -10400,7 +10458,15 @@
       </w:r>
       <w:proofErr w:type="spellEnd"/>
       <w:r>
-        <w:t xml:space="preserve"> (PK)</w:t>
+        <w:t xml:space="preserve"> (</w:t>
+      </w:r>
+      <w:proofErr w:type="spellStart"/>
+      <w:r>
+        <w:t>PK</w:t>
+      </w:r>
+      <w:proofErr w:type="spellEnd"/>
+      <w:r>
+        <w:t>)</w:t>
       </w:r>
     </w:p>
     <w:p>
@@ -10416,7 +10482,15 @@
       </w:r>
       <w:proofErr w:type="spellEnd"/>
       <w:r>
-        <w:t xml:space="preserve"> (FK)</w:t>
+        <w:t xml:space="preserve"> (</w:t>
+      </w:r>
+      <w:proofErr w:type="spellStart"/>
+      <w:r>
+        <w:t>FK</w:t>
+      </w:r>
+      <w:proofErr w:type="spellEnd"/>
+      <w:r>
+        <w:t>)</w:t>
       </w:r>
     </w:p>
     <w:p>
@@ -10503,7 +10577,15 @@
       </w:r>
       <w:proofErr w:type="spellEnd"/>
       <w:r>
-        <w:t xml:space="preserve"> (PK)</w:t>
+        <w:t xml:space="preserve"> (</w:t>
+      </w:r>
+      <w:proofErr w:type="spellStart"/>
+      <w:r>
+        <w:t>PK</w:t>
+      </w:r>
+      <w:proofErr w:type="spellEnd"/>
+      <w:r>
+        <w:t>)</w:t>
       </w:r>
     </w:p>
     <w:p>
@@ -10519,7 +10601,15 @@
       </w:r>
       <w:proofErr w:type="spellEnd"/>
       <w:r>
-        <w:t xml:space="preserve"> (FK)</w:t>
+        <w:t xml:space="preserve"> (</w:t>
+      </w:r>
+      <w:proofErr w:type="spellStart"/>
+      <w:r>
+        <w:t>FK</w:t>
+      </w:r>
+      <w:proofErr w:type="spellEnd"/>
+      <w:r>
+        <w:t>)</w:t>
       </w:r>
     </w:p>
     <w:p>
@@ -10600,7 +10690,15 @@
       </w:r>
       <w:proofErr w:type="spellEnd"/>
       <w:r>
-        <w:t xml:space="preserve"> (PK)</w:t>
+        <w:t xml:space="preserve"> (</w:t>
+      </w:r>
+      <w:proofErr w:type="spellStart"/>
+      <w:r>
+        <w:t>PK</w:t>
+      </w:r>
+      <w:proofErr w:type="spellEnd"/>
+      <w:r>
+        <w:t>)</w:t>
       </w:r>
     </w:p>
     <w:p>
@@ -10616,7 +10714,15 @@
       </w:r>
       <w:proofErr w:type="spellEnd"/>
       <w:r>
-        <w:t xml:space="preserve"> (FK)</w:t>
+        <w:t xml:space="preserve"> (</w:t>
+      </w:r>
+      <w:proofErr w:type="spellStart"/>
+      <w:r>
+        <w:t>FK</w:t>
+      </w:r>
+      <w:proofErr w:type="spellEnd"/>
+      <w:r>
+        <w:t>)</w:t>
       </w:r>
     </w:p>
     <w:p>
@@ -10632,7 +10738,15 @@
       </w:r>
       <w:proofErr w:type="spellEnd"/>
       <w:r>
-        <w:t xml:space="preserve"> (FK)</w:t>
+        <w:t xml:space="preserve"> (</w:t>
+      </w:r>
+      <w:proofErr w:type="spellStart"/>
+      <w:r>
+        <w:t>FK</w:t>
+      </w:r>
+      <w:proofErr w:type="spellEnd"/>
+      <w:r>
+        <w:t>)</w:t>
       </w:r>
     </w:p>
     <w:p>
@@ -22084,6 +22198,21 @@
 </file>
 
 <file path=customXml/item1.xml><?xml version="1.0" encoding="utf-8"?>
+<?mso-contentType ?>
+<FormTemplates xmlns="http://schemas.microsoft.com/sharepoint/v3/contenttype/forms">
+  <Display>DocumentLibraryForm</Display>
+  <Edit>DocumentLibraryForm</Edit>
+  <New>DocumentLibraryForm</New>
+</FormTemplates>
+</file>
+
+<file path=customXml/item2.xml><?xml version="1.0" encoding="utf-8"?>
+<p:properties xmlns:p="http://schemas.microsoft.com/office/2006/metadata/properties" xmlns:xsi="http://www.w3.org/2001/XMLSchema-instance" xmlns:pc="http://schemas.microsoft.com/office/infopath/2007/PartnerControls">
+  <documentManagement/>
+</p:properties>
+</file>
+
+<file path=customXml/item3.xml><?xml version="1.0" encoding="utf-8"?>
 <ct:contentTypeSchema xmlns:ct="http://schemas.microsoft.com/office/2006/metadata/contentType" xmlns:ma="http://schemas.microsoft.com/office/2006/metadata/properties/metaAttributes" ct:_="" ma:_="" ma:contentTypeName="Documento" ma:contentTypeID="0x0101003E64B964EE86E94E88810388061E4AC8" ma:contentTypeVersion="3" ma:contentTypeDescription="Crear nuevo documento." ma:contentTypeScope="" ma:versionID="3c755de4efb81f0959f76dfe4f7a563c">
   <xsd:schema xmlns:xsd="http://www.w3.org/2001/XMLSchema" xmlns:xs="http://www.w3.org/2001/XMLSchema" xmlns:p="http://schemas.microsoft.com/office/2006/metadata/properties" xmlns:ns2="72982a07-b385-426f-8f99-a9bd2486cbec" targetNamespace="http://schemas.microsoft.com/office/2006/metadata/properties" ma:root="true" ma:fieldsID="5f645ab2d71ed821d1fb93c6441734aa" ns2:_="">
     <xsd:import namespace="72982a07-b385-426f-8f99-a9bd2486cbec"/>
@@ -22221,26 +22350,28 @@
 </ct:contentTypeSchema>
 </file>
 
-<file path=customXml/item2.xml><?xml version="1.0" encoding="utf-8"?>
-<p:properties xmlns:p="http://schemas.microsoft.com/office/2006/metadata/properties" xmlns:xsi="http://www.w3.org/2001/XMLSchema-instance" xmlns:pc="http://schemas.microsoft.com/office/infopath/2007/PartnerControls">
-  <documentManagement/>
-</p:properties>
-</file>
-
-<file path=customXml/item3.xml><?xml version="1.0" encoding="utf-8"?>
-<?mso-contentType ?>
-<FormTemplates xmlns="http://schemas.microsoft.com/sharepoint/v3/contenttype/forms">
-  <Display>DocumentLibraryForm</Display>
-  <Edit>DocumentLibraryForm</Edit>
-  <New>DocumentLibraryForm</New>
-</FormTemplates>
-</file>
-
 <file path=customXml/item4.xml><?xml version="1.0" encoding="utf-8"?>
 <b:Sources xmlns:b="http://schemas.openxmlformats.org/officeDocument/2006/bibliography" xmlns="http://schemas.openxmlformats.org/officeDocument/2006/bibliography" SelectedStyle="\APASixthEditionOfficeOnline.xsl" StyleName="APA" Version="6"/>
 </file>
 
 <file path=customXml/itemProps1.xml><?xml version="1.0" encoding="utf-8"?>
+<ds:datastoreItem xmlns:ds="http://schemas.openxmlformats.org/officeDocument/2006/customXml" ds:itemID="{480B8420-1B48-4D23-8D6E-64373AC5070B}">
+  <ds:schemaRefs>
+    <ds:schemaRef ds:uri="http://schemas.microsoft.com/sharepoint/v3/contenttype/forms"/>
+  </ds:schemaRefs>
+</ds:datastoreItem>
+</file>
+
+<file path=customXml/itemProps2.xml><?xml version="1.0" encoding="utf-8"?>
+<ds:datastoreItem xmlns:ds="http://schemas.openxmlformats.org/officeDocument/2006/customXml" ds:itemID="{7F0B1298-25D5-45B9-909D-DD837044A49E}">
+  <ds:schemaRefs>
+    <ds:schemaRef ds:uri="http://schemas.microsoft.com/office/2006/metadata/properties"/>
+    <ds:schemaRef ds:uri="http://schemas.microsoft.com/office/infopath/2007/PartnerControls"/>
+  </ds:schemaRefs>
+</ds:datastoreItem>
+</file>
+
+<file path=customXml/itemProps3.xml><?xml version="1.0" encoding="utf-8"?>
 <ds:datastoreItem xmlns:ds="http://schemas.openxmlformats.org/officeDocument/2006/customXml" ds:itemID="{CAB20FFE-1E23-4B58-9D76-1835AB7D3BED}">
   <ds:schemaRefs>
     <ds:schemaRef ds:uri="http://schemas.microsoft.com/office/2006/metadata/contentType"/>
@@ -22258,23 +22389,6 @@
 </ds:datastoreItem>
 </file>
 
-<file path=customXml/itemProps2.xml><?xml version="1.0" encoding="utf-8"?>
-<ds:datastoreItem xmlns:ds="http://schemas.openxmlformats.org/officeDocument/2006/customXml" ds:itemID="{7F0B1298-25D5-45B9-909D-DD837044A49E}">
-  <ds:schemaRefs>
-    <ds:schemaRef ds:uri="http://schemas.microsoft.com/office/2006/metadata/properties"/>
-    <ds:schemaRef ds:uri="http://schemas.microsoft.com/office/infopath/2007/PartnerControls"/>
-  </ds:schemaRefs>
-</ds:datastoreItem>
-</file>
-
-<file path=customXml/itemProps3.xml><?xml version="1.0" encoding="utf-8"?>
-<ds:datastoreItem xmlns:ds="http://schemas.openxmlformats.org/officeDocument/2006/customXml" ds:itemID="{480B8420-1B48-4D23-8D6E-64373AC5070B}">
-  <ds:schemaRefs>
-    <ds:schemaRef ds:uri="http://schemas.microsoft.com/sharepoint/v3/contenttype/forms"/>
-  </ds:schemaRefs>
-</ds:datastoreItem>
-</file>
-
 <file path=customXml/itemProps4.xml><?xml version="1.0" encoding="utf-8"?>
 <ds:datastoreItem xmlns:ds="http://schemas.openxmlformats.org/officeDocument/2006/customXml" ds:itemID="{BDF99D19-6C5D-43D5-B443-C33B3ADCE9C1}">
   <ds:schemaRefs>

</xml_diff>